<commit_message>
Pricing document: one estimated-cost column, one-line intro
</commit_message>
<xml_diff>
--- a/docs/inference_pricing/EngTrace-inference-pricing.docx
+++ b/docs/inference_pricing/EngTrace-inference-pricing.docx
@@ -21,217 +21,16 @@
     </w:p>
     <w:p>
       <w:pPr>
-        <w:spacing w:after="60" w:before="0"/>
+        <w:spacing w:after="200" w:before="0"/>
       </w:pPr>
       <w:r>
         <w:rPr>
           <w:rFonts w:ascii="Calibri" w:cs="Calibri" w:eastAsia="Calibri" w:hAnsi="Calibri"/>
           <w:color w:val="5B6472"/>
-          <w:sz w:val="22"/>
-          <w:szCs w:val="22"/>
+          <w:sz w:val="21"/>
+          <w:szCs w:val="21"/>
         </w:rPr>
-        <w:t xml:space="preserve">Model prices per million tokens and the estimated cost of one full benchmark run</w:t>
-      </w:r>
-    </w:p>
-    <w:p>
-      <w:pPr>
-        <w:spacing w:after="280" w:before="0"/>
-      </w:pPr>
-      <w:r>
-        <w:rPr>
-          <w:rFonts w:ascii="Calibri" w:cs="Calibri" w:eastAsia="Calibri" w:hAnsi="Calibri"/>
-          <w:i/>
-          <w:iCs/>
-          <w:color w:val="5B6472"/>
-          <w:sz w:val="18"/>
-          <w:szCs w:val="18"/>
-        </w:rPr>
-        <w:t xml:space="preserve">Prices read on OpenRouter, 19–21 September 2026</w:t>
-      </w:r>
-    </w:p>
-    <w:p>
-      <w:pPr>
-        <w:spacing w:after="120" w:before="0"/>
-      </w:pPr>
-      <w:r>
-        <w:rPr>
-          <w:rFonts w:ascii="Calibri" w:cs="Calibri" w:eastAsia="Calibri" w:hAnsi="Calibri"/>
-          <w:color w:val="1F2A37"/>
-          <w:sz w:val="20"/>
-          <w:szCs w:val="20"/>
-        </w:rPr>
-        <w:t xml:space="preserve">The tables list each model’s input and output price. The last two columns estimate what </w:t>
-      </w:r>
-      <w:r>
-        <w:rPr>
-          <w:rFonts w:ascii="Calibri" w:cs="Calibri" w:eastAsia="Calibri" w:hAnsi="Calibri"/>
-          <w:b/>
-          <w:bCs/>
-          <w:color w:val="1F2A37"/>
-          <w:sz w:val="20"/>
-          <w:szCs w:val="20"/>
-        </w:rPr>
-        <w:t xml:space="preserve">one full EngTrace run</w:t>
-      </w:r>
-      <w:r>
-        <w:rPr>
-          <w:rFonts w:ascii="Calibri" w:cs="Calibri" w:eastAsia="Calibri" w:hAnsi="Calibri"/>
-          <w:color w:val="1F2A37"/>
-          <w:sz w:val="20"/>
-          <w:szCs w:val="20"/>
-        </w:rPr>
-        <w:t xml:space="preserve"> costs for that model: 150 templates × 15 instances = 2,250 items, inference only, no evaluation. They use token counts measured on EngTrace’s own evaluator pilot, because a model’s cost depends on how much it writes, and that is not known in advance for a new model:</w:t>
-      </w:r>
-    </w:p>
-    <w:p>
-      <w:pPr>
-        <w:pStyle w:val="ListParagraph"/>
-        <w:numPr>
-          <w:ilvl w:val="0"/>
-          <w:numId w:val="2"/>
-        </w:numPr>
-        <w:spacing w:after="90"/>
-      </w:pPr>
-      <w:r>
-        <w:rPr>
-          <w:rFonts w:ascii="Calibri" w:cs="Calibri" w:eastAsia="Calibri" w:hAnsi="Calibri"/>
-          <w:b/>
-          <w:bCs/>
-          <w:color w:val="1F2A37"/>
-          <w:sz w:val="20"/>
-          <w:szCs w:val="20"/>
-        </w:rPr>
-        <w:t xml:space="preserve">Direct answer: </w:t>
-      </w:r>
-      <w:r>
-        <w:rPr>
-          <w:rFonts w:ascii="Calibri" w:cs="Calibri" w:eastAsia="Calibri" w:hAnsi="Calibri"/>
-          <w:color w:val="1F2A37"/>
-          <w:sz w:val="20"/>
-          <w:szCs w:val="20"/>
-        </w:rPr>
-        <w:t xml:space="preserve">about 318 input and 813 output tokens per item, the average of the pilot’s non-reasoning models.</w:t>
-      </w:r>
-    </w:p>
-    <w:p>
-      <w:pPr>
-        <w:pStyle w:val="ListParagraph"/>
-        <w:numPr>
-          <w:ilvl w:val="0"/>
-          <w:numId w:val="2"/>
-        </w:numPr>
-        <w:spacing w:after="90"/>
-      </w:pPr>
-      <w:r>
-        <w:rPr>
-          <w:rFonts w:ascii="Calibri" w:cs="Calibri" w:eastAsia="Calibri" w:hAnsi="Calibri"/>
-          <w:b/>
-          <w:bCs/>
-          <w:color w:val="1F2A37"/>
-          <w:sz w:val="20"/>
-          <w:szCs w:val="20"/>
-        </w:rPr>
-        <w:t xml:space="preserve">Reasons like GPT-5: </w:t>
-      </w:r>
-      <w:r>
-        <w:rPr>
-          <w:rFonts w:ascii="Calibri" w:cs="Calibri" w:eastAsia="Calibri" w:hAnsi="Calibri"/>
-          <w:color w:val="1F2A37"/>
-          <w:sz w:val="20"/>
-          <w:szCs w:val="20"/>
-        </w:rPr>
-        <w:t xml:space="preserve">about 270 input and 5,232 output tokens per item, GPT-5’s measured average including its reasoning.</w:t>
-      </w:r>
-    </w:p>
-    <w:p>
-      <w:pPr>
-        <w:spacing w:after="120" w:before="60"/>
-      </w:pPr>
-      <w:r>
-        <w:rPr>
-          <w:rFonts w:ascii="Calibri" w:cs="Calibri" w:eastAsia="Calibri" w:hAnsi="Calibri"/>
-          <w:color w:val="1F2A37"/>
-          <w:sz w:val="20"/>
-          <w:szCs w:val="20"/>
-        </w:rPr>
-        <w:t xml:space="preserve">A model’s real cost will usually fall between the two. The heaviest reasoner in the pilot, DeepSeek-R1, wrote about 10,000 output tokens per item, roughly twice the second column.</w:t>
-      </w:r>
-    </w:p>
-    <w:p>
-      <w:pPr>
-        <w:pStyle w:val="Heading2"/>
-        <w:spacing w:after="100" w:before="240"/>
-      </w:pPr>
-      <w:r>
-        <w:rPr>
-          <w:rFonts w:ascii="Calibri" w:cs="Calibri" w:eastAsia="Calibri" w:hAnsi="Calibri"/>
-          <w:b/>
-          <w:bCs/>
-          <w:color w:val="1B3A5C"/>
-          <w:sz w:val="26"/>
-          <w:szCs w:val="26"/>
-        </w:rPr>
-        <w:t xml:space="preserve">Two things to watch</w:t>
-      </w:r>
-    </w:p>
-    <w:p>
-      <w:pPr>
-        <w:pStyle w:val="ListParagraph"/>
-        <w:numPr>
-          <w:ilvl w:val="0"/>
-          <w:numId w:val="2"/>
-        </w:numPr>
-        <w:spacing w:after="90"/>
-      </w:pPr>
-      <w:r>
-        <w:rPr>
-          <w:rFonts w:ascii="Calibri" w:cs="Calibri" w:eastAsia="Calibri" w:hAnsi="Calibri"/>
-          <w:b/>
-          <w:bCs/>
-          <w:color w:val="1F2A37"/>
-          <w:sz w:val="20"/>
-          <w:szCs w:val="20"/>
-        </w:rPr>
-        <w:t xml:space="preserve">Output is where the money goes for reasoning models. </w:t>
-      </w:r>
-      <w:r>
-        <w:rPr>
-          <w:rFonts w:ascii="Calibri" w:cs="Calibri" w:eastAsia="Calibri" w:hAnsi="Calibri"/>
-          <w:color w:val="1F2A37"/>
-          <w:sz w:val="20"/>
-          <w:szCs w:val="20"/>
-        </w:rPr>
-        <w:t xml:space="preserve">Output prices are four to eight times input, and engineering problems produce long reasoning, so the cost tracks how much each model writes.</w:t>
-      </w:r>
-    </w:p>
-    <w:p>
-      <w:pPr>
-        <w:pStyle w:val="ListParagraph"/>
-        <w:numPr>
-          <w:ilvl w:val="0"/>
-          <w:numId w:val="2"/>
-        </w:numPr>
-        <w:spacing w:after="90"/>
-      </w:pPr>
-      <w:r>
-        <w:rPr>
-          <w:rFonts w:ascii="Calibri" w:cs="Calibri" w:eastAsia="Calibri" w:hAnsi="Calibri"/>
-          <w:b/>
-          <w:bCs/>
-          <w:color w:val="1F2A37"/>
-          <w:sz w:val="20"/>
-          <w:szCs w:val="20"/>
-        </w:rPr>
-        <w:t xml:space="preserve">OpenRouter prices move between upstreams from day to day. </w:t>
-      </w:r>
-      <w:r>
-        <w:rPr>
-          <w:rFonts w:ascii="Calibri" w:cs="Calibri" w:eastAsia="Calibri" w:hAnsi="Calibri"/>
-          <w:color w:val="1F2A37"/>
-          <w:sz w:val="20"/>
-          <w:szCs w:val="20"/>
-        </w:rPr>
-        <w:t xml:space="preserve">These were read around 19 to 21 September 2026 and should be re-read before the run.</w:t>
+        <w:t xml:space="preserve">Inference is each model solving every EngTrace problem once: 150 templates × 15 instances = 2,250 runs per model.</w:t>
       </w:r>
     </w:p>
     <w:p>
@@ -282,11 +81,10 @@
         </w:tblBorders>
       </w:tblPr>
       <w:tblGrid>
-        <w:gridCol w:w="3060"/>
-        <w:gridCol w:w="1200"/>
-        <w:gridCol w:w="1200"/>
-        <w:gridCol w:w="1950"/>
-        <w:gridCol w:w="1950"/>
+        <w:gridCol w:w="4560"/>
+        <w:gridCol w:w="1500"/>
+        <w:gridCol w:w="1500"/>
+        <w:gridCol w:w="1800"/>
       </w:tblGrid>
       <w:tr>
         <w:trPr>
@@ -295,7 +93,7 @@
         </w:trPr>
         <w:tc>
           <w:tcPr>
-            <w:tcW w:type="dxa" w:w="3060"/>
+            <w:tcW w:type="dxa" w:w="4560"/>
             <w:tcBorders>
               <w:top w:val="single" w:color="D5DBE3" w:sz="4"/>
               <w:left w:val="single" w:color="D5DBE3" w:sz="4"/>
@@ -330,7 +128,7 @@
         </w:tc>
         <w:tc>
           <w:tcPr>
-            <w:tcW w:type="dxa" w:w="1200"/>
+            <w:tcW w:type="dxa" w:w="1500"/>
             <w:tcBorders>
               <w:top w:val="single" w:color="D5DBE3" w:sz="4"/>
               <w:left w:val="single" w:color="D5DBE3" w:sz="4"/>
@@ -365,7 +163,7 @@
         </w:tc>
         <w:tc>
           <w:tcPr>
-            <w:tcW w:type="dxa" w:w="1200"/>
+            <w:tcW w:type="dxa" w:w="1500"/>
             <w:tcBorders>
               <w:top w:val="single" w:color="D5DBE3" w:sz="4"/>
               <w:left w:val="single" w:color="D5DBE3" w:sz="4"/>
@@ -400,7 +198,7 @@
         </w:tc>
         <w:tc>
           <w:tcPr>
-            <w:tcW w:type="dxa" w:w="1950"/>
+            <w:tcW w:type="dxa" w:w="1800"/>
             <w:tcBorders>
               <w:top w:val="single" w:color="D5DBE3" w:sz="4"/>
               <w:left w:val="single" w:color="D5DBE3" w:sz="4"/>
@@ -429,42 +227,7 @@
                 <w:sz w:val="18"/>
                 <w:szCs w:val="18"/>
               </w:rPr>
-              <w:t xml:space="preserve">Direct answer</w:t>
-            </w:r>
-          </w:p>
-        </w:tc>
-        <w:tc>
-          <w:tcPr>
-            <w:tcW w:type="dxa" w:w="1950"/>
-            <w:tcBorders>
-              <w:top w:val="single" w:color="D5DBE3" w:sz="4"/>
-              <w:left w:val="single" w:color="D5DBE3" w:sz="4"/>
-              <w:bottom w:val="single" w:color="D5DBE3" w:sz="4"/>
-              <w:right w:val="single" w:color="D5DBE3" w:sz="4"/>
-            </w:tcBorders>
-            <w:shd w:fill="E8EDF3" w:color="auto" w:val="clear"/>
-            <w:tcMar>
-              <w:top w:type="dxa" w:w="48"/>
-              <w:left w:type="dxa" w:w="110"/>
-              <w:bottom w:type="dxa" w:w="48"/>
-              <w:right w:type="dxa" w:w="110"/>
-            </w:tcMar>
-          </w:tcPr>
-          <w:p>
-            <w:pPr>
-              <w:keepNext/>
-              <w:jc w:val="right"/>
-            </w:pPr>
-            <w:r>
-              <w:rPr>
-                <w:rFonts w:ascii="Calibri" w:cs="Calibri" w:eastAsia="Calibri" w:hAnsi="Calibri"/>
-                <w:b/>
-                <w:bCs/>
-                <w:color w:val="1B3A5C"/>
-                <w:sz w:val="18"/>
-                <w:szCs w:val="18"/>
-              </w:rPr>
-              <w:t xml:space="preserve">Reasons like GPT-5</w:t>
+              <w:t xml:space="preserve">Est. cost</w:t>
             </w:r>
           </w:p>
         </w:tc>
@@ -475,7 +238,7 @@
         </w:trPr>
         <w:tc>
           <w:tcPr>
-            <w:tcW w:type="dxa" w:w="3060"/>
+            <w:tcW w:type="dxa" w:w="4560"/>
             <w:tcBorders>
               <w:top w:val="single" w:color="D5DBE3" w:sz="4"/>
               <w:left w:val="single" w:color="D5DBE3" w:sz="4"/>
@@ -507,7 +270,7 @@
         </w:tc>
         <w:tc>
           <w:tcPr>
-            <w:tcW w:type="dxa" w:w="1200"/>
+            <w:tcW w:type="dxa" w:w="1500"/>
             <w:tcBorders>
               <w:top w:val="single" w:color="D5DBE3" w:sz="4"/>
               <w:left w:val="single" w:color="D5DBE3" w:sz="4"/>
@@ -539,7 +302,7 @@
         </w:tc>
         <w:tc>
           <w:tcPr>
-            <w:tcW w:type="dxa" w:w="1200"/>
+            <w:tcW w:type="dxa" w:w="1500"/>
             <w:tcBorders>
               <w:top w:val="single" w:color="D5DBE3" w:sz="4"/>
               <w:left w:val="single" w:color="D5DBE3" w:sz="4"/>
@@ -571,39 +334,7 @@
         </w:tc>
         <w:tc>
           <w:tcPr>
-            <w:tcW w:type="dxa" w:w="1950"/>
-            <w:tcBorders>
-              <w:top w:val="single" w:color="D5DBE3" w:sz="4"/>
-              <w:left w:val="single" w:color="D5DBE3" w:sz="4"/>
-              <w:bottom w:val="single" w:color="D5DBE3" w:sz="4"/>
-              <w:right w:val="single" w:color="D5DBE3" w:sz="4"/>
-            </w:tcBorders>
-            <w:tcMar>
-              <w:top w:type="dxa" w:w="48"/>
-              <w:left w:type="dxa" w:w="110"/>
-              <w:bottom w:type="dxa" w:w="48"/>
-              <w:right w:type="dxa" w:w="110"/>
-            </w:tcMar>
-          </w:tcPr>
-          <w:p>
-            <w:pPr>
-              <w:keepNext/>
-              <w:jc w:val="right"/>
-            </w:pPr>
-            <w:r>
-              <w:rPr>
-                <w:rFonts w:ascii="Calibri" w:cs="Calibri" w:eastAsia="Calibri" w:hAnsi="Calibri"/>
-                <w:color w:val="1F2A37"/>
-                <w:sz w:val="19"/>
-                <w:szCs w:val="19"/>
-              </w:rPr>
-              <w:t xml:space="preserve">$0.18</w:t>
-            </w:r>
-          </w:p>
-        </w:tc>
-        <w:tc>
-          <w:tcPr>
-            <w:tcW w:type="dxa" w:w="1950"/>
+            <w:tcW w:type="dxa" w:w="1800"/>
             <w:tcBorders>
               <w:top w:val="single" w:color="D5DBE3" w:sz="4"/>
               <w:left w:val="single" w:color="D5DBE3" w:sz="4"/>
@@ -642,7 +373,7 @@
         </w:trPr>
         <w:tc>
           <w:tcPr>
-            <w:tcW w:type="dxa" w:w="3060"/>
+            <w:tcW w:type="dxa" w:w="4560"/>
             <w:tcBorders>
               <w:top w:val="single" w:color="D5DBE3" w:sz="4"/>
               <w:left w:val="single" w:color="D5DBE3" w:sz="4"/>
@@ -675,7 +406,7 @@
         </w:tc>
         <w:tc>
           <w:tcPr>
-            <w:tcW w:type="dxa" w:w="1200"/>
+            <w:tcW w:type="dxa" w:w="1500"/>
             <w:tcBorders>
               <w:top w:val="single" w:color="D5DBE3" w:sz="4"/>
               <w:left w:val="single" w:color="D5DBE3" w:sz="4"/>
@@ -708,7 +439,7 @@
         </w:tc>
         <w:tc>
           <w:tcPr>
-            <w:tcW w:type="dxa" w:w="1200"/>
+            <w:tcW w:type="dxa" w:w="1500"/>
             <w:tcBorders>
               <w:top w:val="single" w:color="D5DBE3" w:sz="4"/>
               <w:left w:val="single" w:color="D5DBE3" w:sz="4"/>
@@ -741,40 +472,7 @@
         </w:tc>
         <w:tc>
           <w:tcPr>
-            <w:tcW w:type="dxa" w:w="1950"/>
-            <w:tcBorders>
-              <w:top w:val="single" w:color="D5DBE3" w:sz="4"/>
-              <w:left w:val="single" w:color="D5DBE3" w:sz="4"/>
-              <w:bottom w:val="single" w:color="D5DBE3" w:sz="4"/>
-              <w:right w:val="single" w:color="D5DBE3" w:sz="4"/>
-            </w:tcBorders>
-            <w:shd w:fill="F7F9FB" w:color="auto" w:val="clear"/>
-            <w:tcMar>
-              <w:top w:type="dxa" w:w="48"/>
-              <w:left w:type="dxa" w:w="110"/>
-              <w:bottom w:type="dxa" w:w="48"/>
-              <w:right w:type="dxa" w:w="110"/>
-            </w:tcMar>
-          </w:tcPr>
-          <w:p>
-            <w:pPr>
-              <w:keepNext/>
-              <w:jc w:val="right"/>
-            </w:pPr>
-            <w:r>
-              <w:rPr>
-                <w:rFonts w:ascii="Calibri" w:cs="Calibri" w:eastAsia="Calibri" w:hAnsi="Calibri"/>
-                <w:color w:val="1F2A37"/>
-                <w:sz w:val="19"/>
-                <w:szCs w:val="19"/>
-              </w:rPr>
-              <w:t xml:space="preserve">$0.61</w:t>
-            </w:r>
-          </w:p>
-        </w:tc>
-        <w:tc>
-          <w:tcPr>
-            <w:tcW w:type="dxa" w:w="1950"/>
+            <w:tcW w:type="dxa" w:w="1800"/>
             <w:tcBorders>
               <w:top w:val="single" w:color="D5DBE3" w:sz="4"/>
               <w:left w:val="single" w:color="D5DBE3" w:sz="4"/>
@@ -814,7 +512,7 @@
         </w:trPr>
         <w:tc>
           <w:tcPr>
-            <w:tcW w:type="dxa" w:w="3060"/>
+            <w:tcW w:type="dxa" w:w="4560"/>
             <w:tcBorders>
               <w:top w:val="single" w:color="D5DBE3" w:sz="4"/>
               <w:left w:val="single" w:color="D5DBE3" w:sz="4"/>
@@ -846,7 +544,7 @@
         </w:tc>
         <w:tc>
           <w:tcPr>
-            <w:tcW w:type="dxa" w:w="1200"/>
+            <w:tcW w:type="dxa" w:w="1500"/>
             <w:tcBorders>
               <w:top w:val="single" w:color="D5DBE3" w:sz="4"/>
               <w:left w:val="single" w:color="D5DBE3" w:sz="4"/>
@@ -878,7 +576,7 @@
         </w:tc>
         <w:tc>
           <w:tcPr>
-            <w:tcW w:type="dxa" w:w="1200"/>
+            <w:tcW w:type="dxa" w:w="1500"/>
             <w:tcBorders>
               <w:top w:val="single" w:color="D5DBE3" w:sz="4"/>
               <w:left w:val="single" w:color="D5DBE3" w:sz="4"/>
@@ -910,39 +608,7 @@
         </w:tc>
         <w:tc>
           <w:tcPr>
-            <w:tcW w:type="dxa" w:w="1950"/>
-            <w:tcBorders>
-              <w:top w:val="single" w:color="D5DBE3" w:sz="4"/>
-              <w:left w:val="single" w:color="D5DBE3" w:sz="4"/>
-              <w:bottom w:val="single" w:color="D5DBE3" w:sz="4"/>
-              <w:right w:val="single" w:color="D5DBE3" w:sz="4"/>
-            </w:tcBorders>
-            <w:tcMar>
-              <w:top w:type="dxa" w:w="48"/>
-              <w:left w:type="dxa" w:w="110"/>
-              <w:bottom w:type="dxa" w:w="48"/>
-              <w:right w:type="dxa" w:w="110"/>
-            </w:tcMar>
-          </w:tcPr>
-          <w:p>
-            <w:pPr>
-              <w:keepNext/>
-              <w:jc w:val="right"/>
-            </w:pPr>
-            <w:r>
-              <w:rPr>
-                <w:rFonts w:ascii="Calibri" w:cs="Calibri" w:eastAsia="Calibri" w:hAnsi="Calibri"/>
-                <w:color w:val="1F2A37"/>
-                <w:sz w:val="19"/>
-                <w:szCs w:val="19"/>
-              </w:rPr>
-              <w:t xml:space="preserve">$0.79</w:t>
-            </w:r>
-          </w:p>
-        </w:tc>
-        <w:tc>
-          <w:tcPr>
-            <w:tcW w:type="dxa" w:w="1950"/>
+            <w:tcW w:type="dxa" w:w="1800"/>
             <w:tcBorders>
               <w:top w:val="single" w:color="D5DBE3" w:sz="4"/>
               <w:left w:val="single" w:color="D5DBE3" w:sz="4"/>
@@ -981,7 +647,7 @@
         </w:trPr>
         <w:tc>
           <w:tcPr>
-            <w:tcW w:type="dxa" w:w="3060"/>
+            <w:tcW w:type="dxa" w:w="4560"/>
             <w:tcBorders>
               <w:top w:val="single" w:color="D5DBE3" w:sz="4"/>
               <w:left w:val="single" w:color="D5DBE3" w:sz="4"/>
@@ -1014,7 +680,7 @@
         </w:tc>
         <w:tc>
           <w:tcPr>
-            <w:tcW w:type="dxa" w:w="1200"/>
+            <w:tcW w:type="dxa" w:w="1500"/>
             <w:tcBorders>
               <w:top w:val="single" w:color="D5DBE3" w:sz="4"/>
               <w:left w:val="single" w:color="D5DBE3" w:sz="4"/>
@@ -1047,7 +713,7 @@
         </w:tc>
         <w:tc>
           <w:tcPr>
-            <w:tcW w:type="dxa" w:w="1200"/>
+            <w:tcW w:type="dxa" w:w="1500"/>
             <w:tcBorders>
               <w:top w:val="single" w:color="D5DBE3" w:sz="4"/>
               <w:left w:val="single" w:color="D5DBE3" w:sz="4"/>
@@ -1080,40 +746,7 @@
         </w:tc>
         <w:tc>
           <w:tcPr>
-            <w:tcW w:type="dxa" w:w="1950"/>
-            <w:tcBorders>
-              <w:top w:val="single" w:color="D5DBE3" w:sz="4"/>
-              <w:left w:val="single" w:color="D5DBE3" w:sz="4"/>
-              <w:bottom w:val="single" w:color="D5DBE3" w:sz="4"/>
-              <w:right w:val="single" w:color="D5DBE3" w:sz="4"/>
-            </w:tcBorders>
-            <w:shd w:fill="F7F9FB" w:color="auto" w:val="clear"/>
-            <w:tcMar>
-              <w:top w:type="dxa" w:w="48"/>
-              <w:left w:type="dxa" w:w="110"/>
-              <w:bottom w:type="dxa" w:w="48"/>
-              <w:right w:type="dxa" w:w="110"/>
-            </w:tcMar>
-          </w:tcPr>
-          <w:p>
-            <w:pPr>
-              <w:keepNext/>
-              <w:jc w:val="right"/>
-            </w:pPr>
-            <w:r>
-              <w:rPr>
-                <w:rFonts w:ascii="Calibri" w:cs="Calibri" w:eastAsia="Calibri" w:hAnsi="Calibri"/>
-                <w:color w:val="1F2A37"/>
-                <w:sz w:val="19"/>
-                <w:szCs w:val="19"/>
-              </w:rPr>
-              <w:t xml:space="preserve">$0.16</w:t>
-            </w:r>
-          </w:p>
-        </w:tc>
-        <w:tc>
-          <w:tcPr>
-            <w:tcW w:type="dxa" w:w="1950"/>
+            <w:tcW w:type="dxa" w:w="1800"/>
             <w:tcBorders>
               <w:top w:val="single" w:color="D5DBE3" w:sz="4"/>
               <w:left w:val="single" w:color="D5DBE3" w:sz="4"/>
@@ -1153,7 +786,7 @@
         </w:trPr>
         <w:tc>
           <w:tcPr>
-            <w:tcW w:type="dxa" w:w="3060"/>
+            <w:tcW w:type="dxa" w:w="4560"/>
             <w:tcBorders>
               <w:top w:val="single" w:color="D5DBE3" w:sz="4"/>
               <w:left w:val="single" w:color="D5DBE3" w:sz="4"/>
@@ -1185,7 +818,7 @@
         </w:tc>
         <w:tc>
           <w:tcPr>
-            <w:tcW w:type="dxa" w:w="1200"/>
+            <w:tcW w:type="dxa" w:w="1500"/>
             <w:tcBorders>
               <w:top w:val="single" w:color="D5DBE3" w:sz="4"/>
               <w:left w:val="single" w:color="D5DBE3" w:sz="4"/>
@@ -1217,7 +850,7 @@
         </w:tc>
         <w:tc>
           <w:tcPr>
-            <w:tcW w:type="dxa" w:w="1200"/>
+            <w:tcW w:type="dxa" w:w="1500"/>
             <w:tcBorders>
               <w:top w:val="single" w:color="D5DBE3" w:sz="4"/>
               <w:left w:val="single" w:color="D5DBE3" w:sz="4"/>
@@ -1249,39 +882,7 @@
         </w:tc>
         <w:tc>
           <w:tcPr>
-            <w:tcW w:type="dxa" w:w="1950"/>
-            <w:tcBorders>
-              <w:top w:val="single" w:color="D5DBE3" w:sz="4"/>
-              <w:left w:val="single" w:color="D5DBE3" w:sz="4"/>
-              <w:bottom w:val="single" w:color="D5DBE3" w:sz="4"/>
-              <w:right w:val="single" w:color="D5DBE3" w:sz="4"/>
-            </w:tcBorders>
-            <w:tcMar>
-              <w:top w:type="dxa" w:w="48"/>
-              <w:left w:type="dxa" w:w="110"/>
-              <w:bottom w:type="dxa" w:w="48"/>
-              <w:right w:type="dxa" w:w="110"/>
-            </w:tcMar>
-          </w:tcPr>
-          <w:p>
-            <w:pPr>
-              <w:keepNext/>
-              <w:jc w:val="right"/>
-            </w:pPr>
-            <w:r>
-              <w:rPr>
-                <w:rFonts w:ascii="Calibri" w:cs="Calibri" w:eastAsia="Calibri" w:hAnsi="Calibri"/>
-                <w:color w:val="1F2A37"/>
-                <w:sz w:val="19"/>
-                <w:szCs w:val="19"/>
-              </w:rPr>
-              <w:t xml:space="preserve">$0.87</w:t>
-            </w:r>
-          </w:p>
-        </w:tc>
-        <w:tc>
-          <w:tcPr>
-            <w:tcW w:type="dxa" w:w="1950"/>
+            <w:tcW w:type="dxa" w:w="1800"/>
             <w:tcBorders>
               <w:top w:val="single" w:color="D5DBE3" w:sz="4"/>
               <w:left w:val="single" w:color="D5DBE3" w:sz="4"/>
@@ -1320,7 +921,7 @@
         </w:trPr>
         <w:tc>
           <w:tcPr>
-            <w:tcW w:type="dxa" w:w="3060"/>
+            <w:tcW w:type="dxa" w:w="4560"/>
             <w:tcBorders>
               <w:top w:val="single" w:color="D5DBE3" w:sz="4"/>
               <w:left w:val="single" w:color="D5DBE3" w:sz="4"/>
@@ -1353,7 +954,7 @@
         </w:tc>
         <w:tc>
           <w:tcPr>
-            <w:tcW w:type="dxa" w:w="1200"/>
+            <w:tcW w:type="dxa" w:w="1500"/>
             <w:tcBorders>
               <w:top w:val="single" w:color="D5DBE3" w:sz="4"/>
               <w:left w:val="single" w:color="D5DBE3" w:sz="4"/>
@@ -1386,7 +987,7 @@
         </w:tc>
         <w:tc>
           <w:tcPr>
-            <w:tcW w:type="dxa" w:w="1200"/>
+            <w:tcW w:type="dxa" w:w="1500"/>
             <w:tcBorders>
               <w:top w:val="single" w:color="D5DBE3" w:sz="4"/>
               <w:left w:val="single" w:color="D5DBE3" w:sz="4"/>
@@ -1419,40 +1020,7 @@
         </w:tc>
         <w:tc>
           <w:tcPr>
-            <w:tcW w:type="dxa" w:w="1950"/>
-            <w:tcBorders>
-              <w:top w:val="single" w:color="D5DBE3" w:sz="4"/>
-              <w:left w:val="single" w:color="D5DBE3" w:sz="4"/>
-              <w:bottom w:val="single" w:color="D5DBE3" w:sz="4"/>
-              <w:right w:val="single" w:color="D5DBE3" w:sz="4"/>
-            </w:tcBorders>
-            <w:shd w:fill="F7F9FB" w:color="auto" w:val="clear"/>
-            <w:tcMar>
-              <w:top w:type="dxa" w:w="48"/>
-              <w:left w:type="dxa" w:w="110"/>
-              <w:bottom w:type="dxa" w:w="48"/>
-              <w:right w:type="dxa" w:w="110"/>
-            </w:tcMar>
-          </w:tcPr>
-          <w:p>
-            <w:pPr>
-              <w:keepNext/>
-              <w:jc w:val="right"/>
-            </w:pPr>
-            <w:r>
-              <w:rPr>
-                <w:rFonts w:ascii="Calibri" w:cs="Calibri" w:eastAsia="Calibri" w:hAnsi="Calibri"/>
-                <w:color w:val="1F2A37"/>
-                <w:sz w:val="19"/>
-                <w:szCs w:val="19"/>
-              </w:rPr>
-              <w:t xml:space="preserve">$0.70</w:t>
-            </w:r>
-          </w:p>
-        </w:tc>
-        <w:tc>
-          <w:tcPr>
-            <w:tcW w:type="dxa" w:w="1950"/>
+            <w:tcW w:type="dxa" w:w="1800"/>
             <w:tcBorders>
               <w:top w:val="single" w:color="D5DBE3" w:sz="4"/>
               <w:left w:val="single" w:color="D5DBE3" w:sz="4"/>
@@ -1492,7 +1060,7 @@
         </w:trPr>
         <w:tc>
           <w:tcPr>
-            <w:tcW w:type="dxa" w:w="3060"/>
+            <w:tcW w:type="dxa" w:w="4560"/>
             <w:tcBorders>
               <w:top w:val="single" w:color="D5DBE3" w:sz="4"/>
               <w:left w:val="single" w:color="D5DBE3" w:sz="4"/>
@@ -1524,7 +1092,7 @@
         </w:tc>
         <w:tc>
           <w:tcPr>
-            <w:tcW w:type="dxa" w:w="1200"/>
+            <w:tcW w:type="dxa" w:w="1500"/>
             <w:tcBorders>
               <w:top w:val="single" w:color="D5DBE3" w:sz="4"/>
               <w:left w:val="single" w:color="D5DBE3" w:sz="4"/>
@@ -1556,7 +1124,7 @@
         </w:tc>
         <w:tc>
           <w:tcPr>
-            <w:tcW w:type="dxa" w:w="1200"/>
+            <w:tcW w:type="dxa" w:w="1500"/>
             <w:tcBorders>
               <w:top w:val="single" w:color="D5DBE3" w:sz="4"/>
               <w:left w:val="single" w:color="D5DBE3" w:sz="4"/>
@@ -1588,39 +1156,7 @@
         </w:tc>
         <w:tc>
           <w:tcPr>
-            <w:tcW w:type="dxa" w:w="1950"/>
-            <w:tcBorders>
-              <w:top w:val="single" w:color="D5DBE3" w:sz="4"/>
-              <w:left w:val="single" w:color="D5DBE3" w:sz="4"/>
-              <w:bottom w:val="single" w:color="D5DBE3" w:sz="4"/>
-              <w:right w:val="single" w:color="D5DBE3" w:sz="4"/>
-            </w:tcBorders>
-            <w:tcMar>
-              <w:top w:type="dxa" w:w="48"/>
-              <w:left w:type="dxa" w:w="110"/>
-              <w:bottom w:type="dxa" w:w="48"/>
-              <w:right w:type="dxa" w:w="110"/>
-            </w:tcMar>
-          </w:tcPr>
-          <w:p>
-            <w:pPr>
-              <w:keepNext/>
-              <w:jc w:val="right"/>
-            </w:pPr>
-            <w:r>
-              <w:rPr>
-                <w:rFonts w:ascii="Calibri" w:cs="Calibri" w:eastAsia="Calibri" w:hAnsi="Calibri"/>
-                <w:color w:val="1F2A37"/>
-                <w:sz w:val="19"/>
-                <w:szCs w:val="19"/>
-              </w:rPr>
-              <w:t xml:space="preserve">$3.54</w:t>
-            </w:r>
-          </w:p>
-        </w:tc>
-        <w:tc>
-          <w:tcPr>
-            <w:tcW w:type="dxa" w:w="1950"/>
+            <w:tcW w:type="dxa" w:w="1800"/>
             <w:tcBorders>
               <w:top w:val="single" w:color="D5DBE3" w:sz="4"/>
               <w:left w:val="single" w:color="D5DBE3" w:sz="4"/>
@@ -1659,7 +1195,7 @@
         </w:trPr>
         <w:tc>
           <w:tcPr>
-            <w:tcW w:type="dxa" w:w="3060"/>
+            <w:tcW w:type="dxa" w:w="4560"/>
             <w:tcBorders>
               <w:top w:val="single" w:color="D5DBE3" w:sz="4"/>
               <w:left w:val="single" w:color="D5DBE3" w:sz="4"/>
@@ -1692,7 +1228,7 @@
         </w:tc>
         <w:tc>
           <w:tcPr>
-            <w:tcW w:type="dxa" w:w="1200"/>
+            <w:tcW w:type="dxa" w:w="1500"/>
             <w:tcBorders>
               <w:top w:val="single" w:color="D5DBE3" w:sz="4"/>
               <w:left w:val="single" w:color="D5DBE3" w:sz="4"/>
@@ -1725,7 +1261,7 @@
         </w:tc>
         <w:tc>
           <w:tcPr>
-            <w:tcW w:type="dxa" w:w="1200"/>
+            <w:tcW w:type="dxa" w:w="1500"/>
             <w:tcBorders>
               <w:top w:val="single" w:color="D5DBE3" w:sz="4"/>
               <w:left w:val="single" w:color="D5DBE3" w:sz="4"/>
@@ -1758,40 +1294,7 @@
         </w:tc>
         <w:tc>
           <w:tcPr>
-            <w:tcW w:type="dxa" w:w="1950"/>
-            <w:tcBorders>
-              <w:top w:val="single" w:color="D5DBE3" w:sz="4"/>
-              <w:left w:val="single" w:color="D5DBE3" w:sz="4"/>
-              <w:bottom w:val="single" w:color="D5DBE3" w:sz="4"/>
-              <w:right w:val="single" w:color="D5DBE3" w:sz="4"/>
-            </w:tcBorders>
-            <w:shd w:fill="F7F9FB" w:color="auto" w:val="clear"/>
-            <w:tcMar>
-              <w:top w:type="dxa" w:w="48"/>
-              <w:left w:type="dxa" w:w="110"/>
-              <w:bottom w:type="dxa" w:w="48"/>
-              <w:right w:type="dxa" w:w="110"/>
-            </w:tcMar>
-          </w:tcPr>
-          <w:p>
-            <w:pPr>
-              <w:keepNext/>
-              <w:jc w:val="right"/>
-            </w:pPr>
-            <w:r>
-              <w:rPr>
-                <w:rFonts w:ascii="Calibri" w:cs="Calibri" w:eastAsia="Calibri" w:hAnsi="Calibri"/>
-                <w:color w:val="1F2A37"/>
-                <w:sz w:val="19"/>
-                <w:szCs w:val="19"/>
-              </w:rPr>
-              <w:t xml:space="preserve">$0.51</w:t>
-            </w:r>
-          </w:p>
-        </w:tc>
-        <w:tc>
-          <w:tcPr>
-            <w:tcW w:type="dxa" w:w="1950"/>
+            <w:tcW w:type="dxa" w:w="1800"/>
             <w:tcBorders>
               <w:top w:val="single" w:color="D5DBE3" w:sz="4"/>
               <w:left w:val="single" w:color="D5DBE3" w:sz="4"/>
@@ -1831,7 +1334,7 @@
         </w:trPr>
         <w:tc>
           <w:tcPr>
-            <w:tcW w:type="dxa" w:w="3060"/>
+            <w:tcW w:type="dxa" w:w="4560"/>
             <w:tcBorders>
               <w:top w:val="single" w:color="D5DBE3" w:sz="4"/>
               <w:left w:val="single" w:color="D5DBE3" w:sz="4"/>
@@ -1863,7 +1366,7 @@
         </w:tc>
         <w:tc>
           <w:tcPr>
-            <w:tcW w:type="dxa" w:w="1200"/>
+            <w:tcW w:type="dxa" w:w="1500"/>
             <w:tcBorders>
               <w:top w:val="single" w:color="D5DBE3" w:sz="4"/>
               <w:left w:val="single" w:color="D5DBE3" w:sz="4"/>
@@ -1895,7 +1398,7 @@
         </w:tc>
         <w:tc>
           <w:tcPr>
-            <w:tcW w:type="dxa" w:w="1200"/>
+            <w:tcW w:type="dxa" w:w="1500"/>
             <w:tcBorders>
               <w:top w:val="single" w:color="D5DBE3" w:sz="4"/>
               <w:left w:val="single" w:color="D5DBE3" w:sz="4"/>
@@ -1927,39 +1430,7 @@
         </w:tc>
         <w:tc>
           <w:tcPr>
-            <w:tcW w:type="dxa" w:w="1950"/>
-            <w:tcBorders>
-              <w:top w:val="single" w:color="D5DBE3" w:sz="4"/>
-              <w:left w:val="single" w:color="D5DBE3" w:sz="4"/>
-              <w:bottom w:val="single" w:color="D5DBE3" w:sz="4"/>
-              <w:right w:val="single" w:color="D5DBE3" w:sz="4"/>
-            </w:tcBorders>
-            <w:tcMar>
-              <w:top w:type="dxa" w:w="48"/>
-              <w:left w:type="dxa" w:w="110"/>
-              <w:bottom w:type="dxa" w:w="48"/>
-              <w:right w:type="dxa" w:w="110"/>
-            </w:tcMar>
-          </w:tcPr>
-          <w:p>
-            <w:pPr>
-              <w:keepNext/>
-              <w:jc w:val="right"/>
-            </w:pPr>
-            <w:r>
-              <w:rPr>
-                <w:rFonts w:ascii="Calibri" w:cs="Calibri" w:eastAsia="Calibri" w:hAnsi="Calibri"/>
-                <w:color w:val="1F2A37"/>
-                <w:sz w:val="19"/>
-                <w:szCs w:val="19"/>
-              </w:rPr>
-              <w:t xml:space="preserve">$9.05</w:t>
-            </w:r>
-          </w:p>
-        </w:tc>
-        <w:tc>
-          <w:tcPr>
-            <w:tcW w:type="dxa" w:w="1950"/>
+            <w:tcW w:type="dxa" w:w="1800"/>
             <w:tcBorders>
               <w:top w:val="single" w:color="D5DBE3" w:sz="4"/>
               <w:left w:val="single" w:color="D5DBE3" w:sz="4"/>
@@ -1998,7 +1469,7 @@
         </w:trPr>
         <w:tc>
           <w:tcPr>
-            <w:tcW w:type="dxa" w:w="3060"/>
+            <w:tcW w:type="dxa" w:w="4560"/>
             <w:tcBorders>
               <w:top w:val="single" w:color="D5DBE3" w:sz="4"/>
               <w:left w:val="single" w:color="D5DBE3" w:sz="4"/>
@@ -2031,7 +1502,7 @@
         </w:tc>
         <w:tc>
           <w:tcPr>
-            <w:tcW w:type="dxa" w:w="1200"/>
+            <w:tcW w:type="dxa" w:w="1500"/>
             <w:tcBorders>
               <w:top w:val="single" w:color="D5DBE3" w:sz="4"/>
               <w:left w:val="single" w:color="D5DBE3" w:sz="4"/>
@@ -2064,7 +1535,7 @@
         </w:tc>
         <w:tc>
           <w:tcPr>
-            <w:tcW w:type="dxa" w:w="1200"/>
+            <w:tcW w:type="dxa" w:w="1500"/>
             <w:tcBorders>
               <w:top w:val="single" w:color="D5DBE3" w:sz="4"/>
               <w:left w:val="single" w:color="D5DBE3" w:sz="4"/>
@@ -2097,40 +1568,7 @@
         </w:tc>
         <w:tc>
           <w:tcPr>
-            <w:tcW w:type="dxa" w:w="1950"/>
-            <w:tcBorders>
-              <w:top w:val="single" w:color="D5DBE3" w:sz="4"/>
-              <w:left w:val="single" w:color="D5DBE3" w:sz="4"/>
-              <w:bottom w:val="single" w:color="D5DBE3" w:sz="4"/>
-              <w:right w:val="single" w:color="D5DBE3" w:sz="4"/>
-            </w:tcBorders>
-            <w:shd w:fill="F7F9FB" w:color="auto" w:val="clear"/>
-            <w:tcMar>
-              <w:top w:type="dxa" w:w="48"/>
-              <w:left w:type="dxa" w:w="110"/>
-              <w:bottom w:type="dxa" w:w="48"/>
-              <w:right w:type="dxa" w:w="110"/>
-            </w:tcMar>
-          </w:tcPr>
-          <w:p>
-            <w:pPr>
-              <w:keepNext/>
-              <w:jc w:val="right"/>
-            </w:pPr>
-            <w:r>
-              <w:rPr>
-                <w:rFonts w:ascii="Calibri" w:cs="Calibri" w:eastAsia="Calibri" w:hAnsi="Calibri"/>
-                <w:color w:val="1F2A37"/>
-                <w:sz w:val="19"/>
-                <w:szCs w:val="19"/>
-              </w:rPr>
-              <w:t xml:space="preserve">$2.23</w:t>
-            </w:r>
-          </w:p>
-        </w:tc>
-        <w:tc>
-          <w:tcPr>
-            <w:tcW w:type="dxa" w:w="1950"/>
+            <w:tcW w:type="dxa" w:w="1800"/>
             <w:tcBorders>
               <w:top w:val="single" w:color="D5DBE3" w:sz="4"/>
               <w:left w:val="single" w:color="D5DBE3" w:sz="4"/>
@@ -2170,7 +1608,7 @@
         </w:trPr>
         <w:tc>
           <w:tcPr>
-            <w:tcW w:type="dxa" w:w="3060"/>
+            <w:tcW w:type="dxa" w:w="4560"/>
             <w:tcBorders>
               <w:top w:val="single" w:color="D5DBE3" w:sz="4"/>
               <w:left w:val="single" w:color="D5DBE3" w:sz="4"/>
@@ -2202,7 +1640,7 @@
         </w:tc>
         <w:tc>
           <w:tcPr>
-            <w:tcW w:type="dxa" w:w="1200"/>
+            <w:tcW w:type="dxa" w:w="1500"/>
             <w:tcBorders>
               <w:top w:val="single" w:color="D5DBE3" w:sz="4"/>
               <w:left w:val="single" w:color="D5DBE3" w:sz="4"/>
@@ -2234,7 +1672,7 @@
         </w:tc>
         <w:tc>
           <w:tcPr>
-            <w:tcW w:type="dxa" w:w="1200"/>
+            <w:tcW w:type="dxa" w:w="1500"/>
             <w:tcBorders>
               <w:top w:val="single" w:color="D5DBE3" w:sz="4"/>
               <w:left w:val="single" w:color="D5DBE3" w:sz="4"/>
@@ -2266,39 +1704,7 @@
         </w:tc>
         <w:tc>
           <w:tcPr>
-            <w:tcW w:type="dxa" w:w="1950"/>
-            <w:tcBorders>
-              <w:top w:val="single" w:color="D5DBE3" w:sz="4"/>
-              <w:left w:val="single" w:color="D5DBE3" w:sz="4"/>
-              <w:bottom w:val="single" w:color="D5DBE3" w:sz="4"/>
-              <w:right w:val="single" w:color="D5DBE3" w:sz="4"/>
-            </w:tcBorders>
-            <w:tcMar>
-              <w:top w:type="dxa" w:w="48"/>
-              <w:left w:type="dxa" w:w="110"/>
-              <w:bottom w:type="dxa" w:w="48"/>
-              <w:right w:type="dxa" w:w="110"/>
-            </w:tcMar>
-          </w:tcPr>
-          <w:p>
-            <w:pPr>
-              <w:keepNext w:val="false"/>
-              <w:jc w:val="right"/>
-            </w:pPr>
-            <w:r>
-              <w:rPr>
-                <w:rFonts w:ascii="Calibri" w:cs="Calibri" w:eastAsia="Calibri" w:hAnsi="Calibri"/>
-                <w:color w:val="1F2A37"/>
-                <w:sz w:val="19"/>
-                <w:szCs w:val="19"/>
-              </w:rPr>
-              <w:t xml:space="preserve">$22</w:t>
-            </w:r>
-          </w:p>
-        </w:tc>
-        <w:tc>
-          <w:tcPr>
-            <w:tcW w:type="dxa" w:w="1950"/>
+            <w:tcW w:type="dxa" w:w="1800"/>
             <w:tcBorders>
               <w:top w:val="single" w:color="D5DBE3" w:sz="4"/>
               <w:left w:val="single" w:color="D5DBE3" w:sz="4"/>
@@ -2363,11 +1769,10 @@
         </w:tblBorders>
       </w:tblPr>
       <w:tblGrid>
-        <w:gridCol w:w="3060"/>
-        <w:gridCol w:w="1200"/>
-        <w:gridCol w:w="1200"/>
-        <w:gridCol w:w="1950"/>
-        <w:gridCol w:w="1950"/>
+        <w:gridCol w:w="4560"/>
+        <w:gridCol w:w="1500"/>
+        <w:gridCol w:w="1500"/>
+        <w:gridCol w:w="1800"/>
       </w:tblGrid>
       <w:tr>
         <w:trPr>
@@ -2376,7 +1781,7 @@
         </w:trPr>
         <w:tc>
           <w:tcPr>
-            <w:tcW w:type="dxa" w:w="3060"/>
+            <w:tcW w:type="dxa" w:w="4560"/>
             <w:tcBorders>
               <w:top w:val="single" w:color="D5DBE3" w:sz="4"/>
               <w:left w:val="single" w:color="D5DBE3" w:sz="4"/>
@@ -2411,7 +1816,7 @@
         </w:tc>
         <w:tc>
           <w:tcPr>
-            <w:tcW w:type="dxa" w:w="1200"/>
+            <w:tcW w:type="dxa" w:w="1500"/>
             <w:tcBorders>
               <w:top w:val="single" w:color="D5DBE3" w:sz="4"/>
               <w:left w:val="single" w:color="D5DBE3" w:sz="4"/>
@@ -2446,7 +1851,7 @@
         </w:tc>
         <w:tc>
           <w:tcPr>
-            <w:tcW w:type="dxa" w:w="1200"/>
+            <w:tcW w:type="dxa" w:w="1500"/>
             <w:tcBorders>
               <w:top w:val="single" w:color="D5DBE3" w:sz="4"/>
               <w:left w:val="single" w:color="D5DBE3" w:sz="4"/>
@@ -2481,7 +1886,7 @@
         </w:tc>
         <w:tc>
           <w:tcPr>
-            <w:tcW w:type="dxa" w:w="1950"/>
+            <w:tcW w:type="dxa" w:w="1800"/>
             <w:tcBorders>
               <w:top w:val="single" w:color="D5DBE3" w:sz="4"/>
               <w:left w:val="single" w:color="D5DBE3" w:sz="4"/>
@@ -2510,42 +1915,7 @@
                 <w:sz w:val="18"/>
                 <w:szCs w:val="18"/>
               </w:rPr>
-              <w:t xml:space="preserve">Direct answer</w:t>
-            </w:r>
-          </w:p>
-        </w:tc>
-        <w:tc>
-          <w:tcPr>
-            <w:tcW w:type="dxa" w:w="1950"/>
-            <w:tcBorders>
-              <w:top w:val="single" w:color="D5DBE3" w:sz="4"/>
-              <w:left w:val="single" w:color="D5DBE3" w:sz="4"/>
-              <w:bottom w:val="single" w:color="D5DBE3" w:sz="4"/>
-              <w:right w:val="single" w:color="D5DBE3" w:sz="4"/>
-            </w:tcBorders>
-            <w:shd w:fill="E8EDF3" w:color="auto" w:val="clear"/>
-            <w:tcMar>
-              <w:top w:type="dxa" w:w="48"/>
-              <w:left w:type="dxa" w:w="110"/>
-              <w:bottom w:type="dxa" w:w="48"/>
-              <w:right w:type="dxa" w:w="110"/>
-            </w:tcMar>
-          </w:tcPr>
-          <w:p>
-            <w:pPr>
-              <w:keepNext/>
-              <w:jc w:val="right"/>
-            </w:pPr>
-            <w:r>
-              <w:rPr>
-                <w:rFonts w:ascii="Calibri" w:cs="Calibri" w:eastAsia="Calibri" w:hAnsi="Calibri"/>
-                <w:b/>
-                <w:bCs/>
-                <w:color w:val="1B3A5C"/>
-                <w:sz w:val="18"/>
-                <w:szCs w:val="18"/>
-              </w:rPr>
-              <w:t xml:space="preserve">Reasons like GPT-5</w:t>
+              <w:t xml:space="preserve">Est. cost</w:t>
             </w:r>
           </w:p>
         </w:tc>
@@ -2556,7 +1926,7 @@
         </w:trPr>
         <w:tc>
           <w:tcPr>
-            <w:tcW w:type="dxa" w:w="3060"/>
+            <w:tcW w:type="dxa" w:w="4560"/>
             <w:tcBorders>
               <w:top w:val="single" w:color="D5DBE3" w:sz="4"/>
               <w:left w:val="single" w:color="D5DBE3" w:sz="4"/>
@@ -2588,7 +1958,7 @@
         </w:tc>
         <w:tc>
           <w:tcPr>
-            <w:tcW w:type="dxa" w:w="1200"/>
+            <w:tcW w:type="dxa" w:w="1500"/>
             <w:tcBorders>
               <w:top w:val="single" w:color="D5DBE3" w:sz="4"/>
               <w:left w:val="single" w:color="D5DBE3" w:sz="4"/>
@@ -2620,7 +1990,7 @@
         </w:tc>
         <w:tc>
           <w:tcPr>
-            <w:tcW w:type="dxa" w:w="1200"/>
+            <w:tcW w:type="dxa" w:w="1500"/>
             <w:tcBorders>
               <w:top w:val="single" w:color="D5DBE3" w:sz="4"/>
               <w:left w:val="single" w:color="D5DBE3" w:sz="4"/>
@@ -2652,39 +2022,7 @@
         </w:tc>
         <w:tc>
           <w:tcPr>
-            <w:tcW w:type="dxa" w:w="1950"/>
-            <w:tcBorders>
-              <w:top w:val="single" w:color="D5DBE3" w:sz="4"/>
-              <w:left w:val="single" w:color="D5DBE3" w:sz="4"/>
-              <w:bottom w:val="single" w:color="D5DBE3" w:sz="4"/>
-              <w:right w:val="single" w:color="D5DBE3" w:sz="4"/>
-            </w:tcBorders>
-            <w:tcMar>
-              <w:top w:type="dxa" w:w="48"/>
-              <w:left w:type="dxa" w:w="110"/>
-              <w:bottom w:type="dxa" w:w="48"/>
-              <w:right w:type="dxa" w:w="110"/>
-            </w:tcMar>
-          </w:tcPr>
-          <w:p>
-            <w:pPr>
-              <w:keepNext/>
-              <w:jc w:val="right"/>
-            </w:pPr>
-            <w:r>
-              <w:rPr>
-                <w:rFonts w:ascii="Calibri" w:cs="Calibri" w:eastAsia="Calibri" w:hAnsi="Calibri"/>
-                <w:color w:val="1F2A37"/>
-                <w:sz w:val="19"/>
-                <w:szCs w:val="19"/>
-              </w:rPr>
-              <w:t xml:space="preserve">$0.77</w:t>
-            </w:r>
-          </w:p>
-        </w:tc>
-        <w:tc>
-          <w:tcPr>
-            <w:tcW w:type="dxa" w:w="1950"/>
+            <w:tcW w:type="dxa" w:w="1800"/>
             <w:tcBorders>
               <w:top w:val="single" w:color="D5DBE3" w:sz="4"/>
               <w:left w:val="single" w:color="D5DBE3" w:sz="4"/>
@@ -2723,7 +2061,7 @@
         </w:trPr>
         <w:tc>
           <w:tcPr>
-            <w:tcW w:type="dxa" w:w="3060"/>
+            <w:tcW w:type="dxa" w:w="4560"/>
             <w:tcBorders>
               <w:top w:val="single" w:color="D5DBE3" w:sz="4"/>
               <w:left w:val="single" w:color="D5DBE3" w:sz="4"/>
@@ -2756,7 +2094,7 @@
         </w:tc>
         <w:tc>
           <w:tcPr>
-            <w:tcW w:type="dxa" w:w="1200"/>
+            <w:tcW w:type="dxa" w:w="1500"/>
             <w:tcBorders>
               <w:top w:val="single" w:color="D5DBE3" w:sz="4"/>
               <w:left w:val="single" w:color="D5DBE3" w:sz="4"/>
@@ -2789,7 +2127,7 @@
         </w:tc>
         <w:tc>
           <w:tcPr>
-            <w:tcW w:type="dxa" w:w="1200"/>
+            <w:tcW w:type="dxa" w:w="1500"/>
             <w:tcBorders>
               <w:top w:val="single" w:color="D5DBE3" w:sz="4"/>
               <w:left w:val="single" w:color="D5DBE3" w:sz="4"/>
@@ -2822,40 +2160,7 @@
         </w:tc>
         <w:tc>
           <w:tcPr>
-            <w:tcW w:type="dxa" w:w="1950"/>
-            <w:tcBorders>
-              <w:top w:val="single" w:color="D5DBE3" w:sz="4"/>
-              <w:left w:val="single" w:color="D5DBE3" w:sz="4"/>
-              <w:bottom w:val="single" w:color="D5DBE3" w:sz="4"/>
-              <w:right w:val="single" w:color="D5DBE3" w:sz="4"/>
-            </w:tcBorders>
-            <w:shd w:fill="F7F9FB" w:color="auto" w:val="clear"/>
-            <w:tcMar>
-              <w:top w:type="dxa" w:w="48"/>
-              <w:left w:type="dxa" w:w="110"/>
-              <w:bottom w:type="dxa" w:w="48"/>
-              <w:right w:type="dxa" w:w="110"/>
-            </w:tcMar>
-          </w:tcPr>
-          <w:p>
-            <w:pPr>
-              <w:keepNext/>
-              <w:jc w:val="right"/>
-            </w:pPr>
-            <w:r>
-              <w:rPr>
-                <w:rFonts w:ascii="Calibri" w:cs="Calibri" w:eastAsia="Calibri" w:hAnsi="Calibri"/>
-                <w:color w:val="1F2A37"/>
-                <w:sz w:val="19"/>
-                <w:szCs w:val="19"/>
-              </w:rPr>
-              <w:t xml:space="preserve">$2.34</w:t>
-            </w:r>
-          </w:p>
-        </w:tc>
-        <w:tc>
-          <w:tcPr>
-            <w:tcW w:type="dxa" w:w="1950"/>
+            <w:tcW w:type="dxa" w:w="1800"/>
             <w:tcBorders>
               <w:top w:val="single" w:color="D5DBE3" w:sz="4"/>
               <w:left w:val="single" w:color="D5DBE3" w:sz="4"/>
@@ -2895,7 +2200,7 @@
         </w:trPr>
         <w:tc>
           <w:tcPr>
-            <w:tcW w:type="dxa" w:w="3060"/>
+            <w:tcW w:type="dxa" w:w="4560"/>
             <w:tcBorders>
               <w:top w:val="single" w:color="D5DBE3" w:sz="4"/>
               <w:left w:val="single" w:color="D5DBE3" w:sz="4"/>
@@ -2927,7 +2232,7 @@
         </w:tc>
         <w:tc>
           <w:tcPr>
-            <w:tcW w:type="dxa" w:w="1200"/>
+            <w:tcW w:type="dxa" w:w="1500"/>
             <w:tcBorders>
               <w:top w:val="single" w:color="D5DBE3" w:sz="4"/>
               <w:left w:val="single" w:color="D5DBE3" w:sz="4"/>
@@ -2959,7 +2264,7 @@
         </w:tc>
         <w:tc>
           <w:tcPr>
-            <w:tcW w:type="dxa" w:w="1200"/>
+            <w:tcW w:type="dxa" w:w="1500"/>
             <w:tcBorders>
               <w:top w:val="single" w:color="D5DBE3" w:sz="4"/>
               <w:left w:val="single" w:color="D5DBE3" w:sz="4"/>
@@ -2991,39 +2296,7 @@
         </w:tc>
         <w:tc>
           <w:tcPr>
-            <w:tcW w:type="dxa" w:w="1950"/>
-            <w:tcBorders>
-              <w:top w:val="single" w:color="D5DBE3" w:sz="4"/>
-              <w:left w:val="single" w:color="D5DBE3" w:sz="4"/>
-              <w:bottom w:val="single" w:color="D5DBE3" w:sz="4"/>
-              <w:right w:val="single" w:color="D5DBE3" w:sz="4"/>
-            </w:tcBorders>
-            <w:tcMar>
-              <w:top w:type="dxa" w:w="48"/>
-              <w:left w:type="dxa" w:w="110"/>
-              <w:bottom w:type="dxa" w:w="48"/>
-              <w:right w:type="dxa" w:w="110"/>
-            </w:tcMar>
-          </w:tcPr>
-          <w:p>
-            <w:pPr>
-              <w:keepNext/>
-              <w:jc w:val="right"/>
-            </w:pPr>
-            <w:r>
-              <w:rPr>
-                <w:rFonts w:ascii="Calibri" w:cs="Calibri" w:eastAsia="Calibri" w:hAnsi="Calibri"/>
-                <w:color w:val="1F2A37"/>
-                <w:sz w:val="19"/>
-                <w:szCs w:val="19"/>
-              </w:rPr>
-              <w:t xml:space="preserve">$2.43</w:t>
-            </w:r>
-          </w:p>
-        </w:tc>
-        <w:tc>
-          <w:tcPr>
-            <w:tcW w:type="dxa" w:w="1950"/>
+            <w:tcW w:type="dxa" w:w="1800"/>
             <w:tcBorders>
               <w:top w:val="single" w:color="D5DBE3" w:sz="4"/>
               <w:left w:val="single" w:color="D5DBE3" w:sz="4"/>
@@ -3062,7 +2335,7 @@
         </w:trPr>
         <w:tc>
           <w:tcPr>
-            <w:tcW w:type="dxa" w:w="3060"/>
+            <w:tcW w:type="dxa" w:w="4560"/>
             <w:tcBorders>
               <w:top w:val="single" w:color="D5DBE3" w:sz="4"/>
               <w:left w:val="single" w:color="D5DBE3" w:sz="4"/>
@@ -3095,7 +2368,7 @@
         </w:tc>
         <w:tc>
           <w:tcPr>
-            <w:tcW w:type="dxa" w:w="1200"/>
+            <w:tcW w:type="dxa" w:w="1500"/>
             <w:tcBorders>
               <w:top w:val="single" w:color="D5DBE3" w:sz="4"/>
               <w:left w:val="single" w:color="D5DBE3" w:sz="4"/>
@@ -3128,7 +2401,7 @@
         </w:tc>
         <w:tc>
           <w:tcPr>
-            <w:tcW w:type="dxa" w:w="1200"/>
+            <w:tcW w:type="dxa" w:w="1500"/>
             <w:tcBorders>
               <w:top w:val="single" w:color="D5DBE3" w:sz="4"/>
               <w:left w:val="single" w:color="D5DBE3" w:sz="4"/>
@@ -3161,40 +2434,7 @@
         </w:tc>
         <w:tc>
           <w:tcPr>
-            <w:tcW w:type="dxa" w:w="1950"/>
-            <w:tcBorders>
-              <w:top w:val="single" w:color="D5DBE3" w:sz="4"/>
-              <w:left w:val="single" w:color="D5DBE3" w:sz="4"/>
-              <w:bottom w:val="single" w:color="D5DBE3" w:sz="4"/>
-              <w:right w:val="single" w:color="D5DBE3" w:sz="4"/>
-            </w:tcBorders>
-            <w:shd w:fill="F7F9FB" w:color="auto" w:val="clear"/>
-            <w:tcMar>
-              <w:top w:type="dxa" w:w="48"/>
-              <w:left w:type="dxa" w:w="110"/>
-              <w:bottom w:type="dxa" w:w="48"/>
-              <w:right w:type="dxa" w:w="110"/>
-            </w:tcMar>
-          </w:tcPr>
-          <w:p>
-            <w:pPr>
-              <w:keepNext/>
-              <w:jc w:val="right"/>
-            </w:pPr>
-            <w:r>
-              <w:rPr>
-                <w:rFonts w:ascii="Calibri" w:cs="Calibri" w:eastAsia="Calibri" w:hAnsi="Calibri"/>
-                <w:color w:val="1F2A37"/>
-                <w:sz w:val="19"/>
-                <w:szCs w:val="19"/>
-              </w:rPr>
-              <w:t xml:space="preserve">$3.84</w:t>
-            </w:r>
-          </w:p>
-        </w:tc>
-        <w:tc>
-          <w:tcPr>
-            <w:tcW w:type="dxa" w:w="1950"/>
+            <w:tcW w:type="dxa" w:w="1800"/>
             <w:tcBorders>
               <w:top w:val="single" w:color="D5DBE3" w:sz="4"/>
               <w:left w:val="single" w:color="D5DBE3" w:sz="4"/>
@@ -3234,7 +2474,7 @@
         </w:trPr>
         <w:tc>
           <w:tcPr>
-            <w:tcW w:type="dxa" w:w="3060"/>
+            <w:tcW w:type="dxa" w:w="4560"/>
             <w:tcBorders>
               <w:top w:val="single" w:color="D5DBE3" w:sz="4"/>
               <w:left w:val="single" w:color="D5DBE3" w:sz="4"/>
@@ -3266,7 +2506,7 @@
         </w:tc>
         <w:tc>
           <w:tcPr>
-            <w:tcW w:type="dxa" w:w="1200"/>
+            <w:tcW w:type="dxa" w:w="1500"/>
             <w:tcBorders>
               <w:top w:val="single" w:color="D5DBE3" w:sz="4"/>
               <w:left w:val="single" w:color="D5DBE3" w:sz="4"/>
@@ -3298,7 +2538,7 @@
         </w:tc>
         <w:tc>
           <w:tcPr>
-            <w:tcW w:type="dxa" w:w="1200"/>
+            <w:tcW w:type="dxa" w:w="1500"/>
             <w:tcBorders>
               <w:top w:val="single" w:color="D5DBE3" w:sz="4"/>
               <w:left w:val="single" w:color="D5DBE3" w:sz="4"/>
@@ -3330,39 +2570,7 @@
         </w:tc>
         <w:tc>
           <w:tcPr>
-            <w:tcW w:type="dxa" w:w="1950"/>
-            <w:tcBorders>
-              <w:top w:val="single" w:color="D5DBE3" w:sz="4"/>
-              <w:left w:val="single" w:color="D5DBE3" w:sz="4"/>
-              <w:bottom w:val="single" w:color="D5DBE3" w:sz="4"/>
-              <w:right w:val="single" w:color="D5DBE3" w:sz="4"/>
-            </w:tcBorders>
-            <w:tcMar>
-              <w:top w:type="dxa" w:w="48"/>
-              <w:left w:type="dxa" w:w="110"/>
-              <w:bottom w:type="dxa" w:w="48"/>
-              <w:right w:type="dxa" w:w="110"/>
-            </w:tcMar>
-          </w:tcPr>
-          <w:p>
-            <w:pPr>
-              <w:keepNext/>
-              <w:jc w:val="right"/>
-            </w:pPr>
-            <w:r>
-              <w:rPr>
-                <w:rFonts w:ascii="Calibri" w:cs="Calibri" w:eastAsia="Calibri" w:hAnsi="Calibri"/>
-                <w:color w:val="1F2A37"/>
-                <w:sz w:val="19"/>
-                <w:szCs w:val="19"/>
-              </w:rPr>
-              <w:t xml:space="preserve">$8.77</w:t>
-            </w:r>
-          </w:p>
-        </w:tc>
-        <w:tc>
-          <w:tcPr>
-            <w:tcW w:type="dxa" w:w="1950"/>
+            <w:tcW w:type="dxa" w:w="1800"/>
             <w:tcBorders>
               <w:top w:val="single" w:color="D5DBE3" w:sz="4"/>
               <w:left w:val="single" w:color="D5DBE3" w:sz="4"/>
@@ -3401,7 +2609,7 @@
         </w:trPr>
         <w:tc>
           <w:tcPr>
-            <w:tcW w:type="dxa" w:w="3060"/>
+            <w:tcW w:type="dxa" w:w="4560"/>
             <w:tcBorders>
               <w:top w:val="single" w:color="D5DBE3" w:sz="4"/>
               <w:left w:val="single" w:color="D5DBE3" w:sz="4"/>
@@ -3434,7 +2642,7 @@
         </w:tc>
         <w:tc>
           <w:tcPr>
-            <w:tcW w:type="dxa" w:w="1200"/>
+            <w:tcW w:type="dxa" w:w="1500"/>
             <w:tcBorders>
               <w:top w:val="single" w:color="D5DBE3" w:sz="4"/>
               <w:left w:val="single" w:color="D5DBE3" w:sz="4"/>
@@ -3467,7 +2675,7 @@
         </w:tc>
         <w:tc>
           <w:tcPr>
-            <w:tcW w:type="dxa" w:w="1200"/>
+            <w:tcW w:type="dxa" w:w="1500"/>
             <w:tcBorders>
               <w:top w:val="single" w:color="D5DBE3" w:sz="4"/>
               <w:left w:val="single" w:color="D5DBE3" w:sz="4"/>
@@ -3500,40 +2708,7 @@
         </w:tc>
         <w:tc>
           <w:tcPr>
-            <w:tcW w:type="dxa" w:w="1950"/>
-            <w:tcBorders>
-              <w:top w:val="single" w:color="D5DBE3" w:sz="4"/>
-              <w:left w:val="single" w:color="D5DBE3" w:sz="4"/>
-              <w:bottom w:val="single" w:color="D5DBE3" w:sz="4"/>
-              <w:right w:val="single" w:color="D5DBE3" w:sz="4"/>
-            </w:tcBorders>
-            <w:shd w:fill="F7F9FB" w:color="auto" w:val="clear"/>
-            <w:tcMar>
-              <w:top w:type="dxa" w:w="48"/>
-              <w:left w:type="dxa" w:w="110"/>
-              <w:bottom w:type="dxa" w:w="48"/>
-              <w:right w:type="dxa" w:w="110"/>
-            </w:tcMar>
-          </w:tcPr>
-          <w:p>
-            <w:pPr>
-              <w:keepNext/>
-              <w:jc w:val="right"/>
-            </w:pPr>
-            <w:r>
-              <w:rPr>
-                <w:rFonts w:ascii="Calibri" w:cs="Calibri" w:eastAsia="Calibri" w:hAnsi="Calibri"/>
-                <w:color w:val="1F2A37"/>
-                <w:sz w:val="19"/>
-                <w:szCs w:val="19"/>
-              </w:rPr>
-              <w:t xml:space="preserve">$19</w:t>
-            </w:r>
-          </w:p>
-        </w:tc>
-        <w:tc>
-          <w:tcPr>
-            <w:tcW w:type="dxa" w:w="1950"/>
+            <w:tcW w:type="dxa" w:w="1800"/>
             <w:tcBorders>
               <w:top w:val="single" w:color="D5DBE3" w:sz="4"/>
               <w:left w:val="single" w:color="D5DBE3" w:sz="4"/>
@@ -3573,7 +2748,7 @@
         </w:trPr>
         <w:tc>
           <w:tcPr>
-            <w:tcW w:type="dxa" w:w="3060"/>
+            <w:tcW w:type="dxa" w:w="4560"/>
             <w:tcBorders>
               <w:top w:val="single" w:color="D5DBE3" w:sz="4"/>
               <w:left w:val="single" w:color="D5DBE3" w:sz="4"/>
@@ -3605,7 +2780,7 @@
         </w:tc>
         <w:tc>
           <w:tcPr>
-            <w:tcW w:type="dxa" w:w="1200"/>
+            <w:tcW w:type="dxa" w:w="1500"/>
             <w:tcBorders>
               <w:top w:val="single" w:color="D5DBE3" w:sz="4"/>
               <w:left w:val="single" w:color="D5DBE3" w:sz="4"/>
@@ -3637,7 +2812,7 @@
         </w:tc>
         <w:tc>
           <w:tcPr>
-            <w:tcW w:type="dxa" w:w="1200"/>
+            <w:tcW w:type="dxa" w:w="1500"/>
             <w:tcBorders>
               <w:top w:val="single" w:color="D5DBE3" w:sz="4"/>
               <w:left w:val="single" w:color="D5DBE3" w:sz="4"/>
@@ -3669,39 +2844,7 @@
         </w:tc>
         <w:tc>
           <w:tcPr>
-            <w:tcW w:type="dxa" w:w="1950"/>
-            <w:tcBorders>
-              <w:top w:val="single" w:color="D5DBE3" w:sz="4"/>
-              <w:left w:val="single" w:color="D5DBE3" w:sz="4"/>
-              <w:bottom w:val="single" w:color="D5DBE3" w:sz="4"/>
-              <w:right w:val="single" w:color="D5DBE3" w:sz="4"/>
-            </w:tcBorders>
-            <w:tcMar>
-              <w:top w:type="dxa" w:w="48"/>
-              <w:left w:type="dxa" w:w="110"/>
-              <w:bottom w:type="dxa" w:w="48"/>
-              <w:right w:type="dxa" w:w="110"/>
-            </w:tcMar>
-          </w:tcPr>
-          <w:p>
-            <w:pPr>
-              <w:keepNext/>
-              <w:jc w:val="right"/>
-            </w:pPr>
-            <w:r>
-              <w:rPr>
-                <w:rFonts w:ascii="Calibri" w:cs="Calibri" w:eastAsia="Calibri" w:hAnsi="Calibri"/>
-                <w:color w:val="1F2A37"/>
-                <w:sz w:val="19"/>
-                <w:szCs w:val="19"/>
-              </w:rPr>
-              <w:t xml:space="preserve">$23</w:t>
-            </w:r>
-          </w:p>
-        </w:tc>
-        <w:tc>
-          <w:tcPr>
-            <w:tcW w:type="dxa" w:w="1950"/>
+            <w:tcW w:type="dxa" w:w="1800"/>
             <w:tcBorders>
               <w:top w:val="single" w:color="D5DBE3" w:sz="4"/>
               <w:left w:val="single" w:color="D5DBE3" w:sz="4"/>
@@ -3740,7 +2883,7 @@
         </w:trPr>
         <w:tc>
           <w:tcPr>
-            <w:tcW w:type="dxa" w:w="3060"/>
+            <w:tcW w:type="dxa" w:w="4560"/>
             <w:tcBorders>
               <w:top w:val="single" w:color="D5DBE3" w:sz="4"/>
               <w:left w:val="single" w:color="D5DBE3" w:sz="4"/>
@@ -3773,7 +2916,7 @@
         </w:tc>
         <w:tc>
           <w:tcPr>
-            <w:tcW w:type="dxa" w:w="1200"/>
+            <w:tcW w:type="dxa" w:w="1500"/>
             <w:tcBorders>
               <w:top w:val="single" w:color="D5DBE3" w:sz="4"/>
               <w:left w:val="single" w:color="D5DBE3" w:sz="4"/>
@@ -3806,7 +2949,7 @@
         </w:tc>
         <w:tc>
           <w:tcPr>
-            <w:tcW w:type="dxa" w:w="1200"/>
+            <w:tcW w:type="dxa" w:w="1500"/>
             <w:tcBorders>
               <w:top w:val="single" w:color="D5DBE3" w:sz="4"/>
               <w:left w:val="single" w:color="D5DBE3" w:sz="4"/>
@@ -3839,40 +2982,7 @@
         </w:tc>
         <w:tc>
           <w:tcPr>
-            <w:tcW w:type="dxa" w:w="1950"/>
-            <w:tcBorders>
-              <w:top w:val="single" w:color="D5DBE3" w:sz="4"/>
-              <w:left w:val="single" w:color="D5DBE3" w:sz="4"/>
-              <w:bottom w:val="single" w:color="D5DBE3" w:sz="4"/>
-              <w:right w:val="single" w:color="D5DBE3" w:sz="4"/>
-            </w:tcBorders>
-            <w:shd w:fill="F7F9FB" w:color="auto" w:val="clear"/>
-            <w:tcMar>
-              <w:top w:type="dxa" w:w="48"/>
-              <w:left w:type="dxa" w:w="110"/>
-              <w:bottom w:type="dxa" w:w="48"/>
-              <w:right w:type="dxa" w:w="110"/>
-            </w:tcMar>
-          </w:tcPr>
-          <w:p>
-            <w:pPr>
-              <w:keepNext/>
-              <w:jc w:val="right"/>
-            </w:pPr>
-            <w:r>
-              <w:rPr>
-                <w:rFonts w:ascii="Calibri" w:cs="Calibri" w:eastAsia="Calibri" w:hAnsi="Calibri"/>
-                <w:color w:val="1F2A37"/>
-                <w:sz w:val="19"/>
-                <w:szCs w:val="19"/>
-              </w:rPr>
-              <w:t xml:space="preserve">$39</w:t>
-            </w:r>
-          </w:p>
-        </w:tc>
-        <w:tc>
-          <w:tcPr>
-            <w:tcW w:type="dxa" w:w="1950"/>
+            <w:tcW w:type="dxa" w:w="1800"/>
             <w:tcBorders>
               <w:top w:val="single" w:color="D5DBE3" w:sz="4"/>
               <w:left w:val="single" w:color="D5DBE3" w:sz="4"/>
@@ -3912,7 +3022,7 @@
         </w:trPr>
         <w:tc>
           <w:tcPr>
-            <w:tcW w:type="dxa" w:w="3060"/>
+            <w:tcW w:type="dxa" w:w="4560"/>
             <w:tcBorders>
               <w:top w:val="single" w:color="D5DBE3" w:sz="4"/>
               <w:left w:val="single" w:color="D5DBE3" w:sz="4"/>
@@ -3944,7 +3054,7 @@
         </w:tc>
         <w:tc>
           <w:tcPr>
-            <w:tcW w:type="dxa" w:w="1200"/>
+            <w:tcW w:type="dxa" w:w="1500"/>
             <w:tcBorders>
               <w:top w:val="single" w:color="D5DBE3" w:sz="4"/>
               <w:left w:val="single" w:color="D5DBE3" w:sz="4"/>
@@ -3976,7 +3086,7 @@
         </w:tc>
         <w:tc>
           <w:tcPr>
-            <w:tcW w:type="dxa" w:w="1200"/>
+            <w:tcW w:type="dxa" w:w="1500"/>
             <w:tcBorders>
               <w:top w:val="single" w:color="D5DBE3" w:sz="4"/>
               <w:left w:val="single" w:color="D5DBE3" w:sz="4"/>
@@ -4008,39 +3118,7 @@
         </w:tc>
         <w:tc>
           <w:tcPr>
-            <w:tcW w:type="dxa" w:w="1950"/>
-            <w:tcBorders>
-              <w:top w:val="single" w:color="D5DBE3" w:sz="4"/>
-              <w:left w:val="single" w:color="D5DBE3" w:sz="4"/>
-              <w:bottom w:val="single" w:color="D5DBE3" w:sz="4"/>
-              <w:right w:val="single" w:color="D5DBE3" w:sz="4"/>
-            </w:tcBorders>
-            <w:tcMar>
-              <w:top w:type="dxa" w:w="48"/>
-              <w:left w:type="dxa" w:w="110"/>
-              <w:bottom w:type="dxa" w:w="48"/>
-              <w:right w:type="dxa" w:w="110"/>
-            </w:tcMar>
-          </w:tcPr>
-          <w:p>
-            <w:pPr>
-              <w:keepNext/>
-              <w:jc w:val="right"/>
-            </w:pPr>
-            <w:r>
-              <w:rPr>
-                <w:rFonts w:ascii="Calibri" w:cs="Calibri" w:eastAsia="Calibri" w:hAnsi="Calibri"/>
-                <w:color w:val="1F2A37"/>
-                <w:sz w:val="19"/>
-                <w:szCs w:val="19"/>
-              </w:rPr>
-              <w:t xml:space="preserve">$58</w:t>
-            </w:r>
-          </w:p>
-        </w:tc>
-        <w:tc>
-          <w:tcPr>
-            <w:tcW w:type="dxa" w:w="1950"/>
+            <w:tcW w:type="dxa" w:w="1800"/>
             <w:tcBorders>
               <w:top w:val="single" w:color="D5DBE3" w:sz="4"/>
               <w:left w:val="single" w:color="D5DBE3" w:sz="4"/>
@@ -4079,7 +3157,7 @@
         </w:trPr>
         <w:tc>
           <w:tcPr>
-            <w:tcW w:type="dxa" w:w="3060"/>
+            <w:tcW w:type="dxa" w:w="4560"/>
             <w:tcBorders>
               <w:top w:val="single" w:color="D5DBE3" w:sz="4"/>
               <w:left w:val="single" w:color="D5DBE3" w:sz="4"/>
@@ -4112,7 +3190,7 @@
         </w:tc>
         <w:tc>
           <w:tcPr>
-            <w:tcW w:type="dxa" w:w="1200"/>
+            <w:tcW w:type="dxa" w:w="1500"/>
             <w:tcBorders>
               <w:top w:val="single" w:color="D5DBE3" w:sz="4"/>
               <w:left w:val="single" w:color="D5DBE3" w:sz="4"/>
@@ -4145,7 +3223,7 @@
         </w:tc>
         <w:tc>
           <w:tcPr>
-            <w:tcW w:type="dxa" w:w="1200"/>
+            <w:tcW w:type="dxa" w:w="1500"/>
             <w:tcBorders>
               <w:top w:val="single" w:color="D5DBE3" w:sz="4"/>
               <w:left w:val="single" w:color="D5DBE3" w:sz="4"/>
@@ -4178,40 +3256,7 @@
         </w:tc>
         <w:tc>
           <w:tcPr>
-            <w:tcW w:type="dxa" w:w="1950"/>
-            <w:tcBorders>
-              <w:top w:val="single" w:color="D5DBE3" w:sz="4"/>
-              <w:left w:val="single" w:color="D5DBE3" w:sz="4"/>
-              <w:bottom w:val="single" w:color="D5DBE3" w:sz="4"/>
-              <w:right w:val="single" w:color="D5DBE3" w:sz="4"/>
-            </w:tcBorders>
-            <w:shd w:fill="F7F9FB" w:color="auto" w:val="clear"/>
-            <w:tcMar>
-              <w:top w:type="dxa" w:w="48"/>
-              <w:left w:type="dxa" w:w="110"/>
-              <w:bottom w:type="dxa" w:w="48"/>
-              <w:right w:type="dxa" w:w="110"/>
-            </w:tcMar>
-          </w:tcPr>
-          <w:p>
-            <w:pPr>
-              <w:keepNext w:val="false"/>
-              <w:jc w:val="right"/>
-            </w:pPr>
-            <w:r>
-              <w:rPr>
-                <w:rFonts w:ascii="Calibri" w:cs="Calibri" w:eastAsia="Calibri" w:hAnsi="Calibri"/>
-                <w:color w:val="1F2A37"/>
-                <w:sz w:val="19"/>
-                <w:szCs w:val="19"/>
-              </w:rPr>
-              <w:t xml:space="preserve">$99</w:t>
-            </w:r>
-          </w:p>
-        </w:tc>
-        <w:tc>
-          <w:tcPr>
-            <w:tcW w:type="dxa" w:w="1950"/>
+            <w:tcW w:type="dxa" w:w="1800"/>
             <w:tcBorders>
               <w:top w:val="single" w:color="D5DBE3" w:sz="4"/>
               <w:left w:val="single" w:color="D5DBE3" w:sz="4"/>
@@ -4277,11 +3322,10 @@
         </w:tblBorders>
       </w:tblPr>
       <w:tblGrid>
-        <w:gridCol w:w="3060"/>
-        <w:gridCol w:w="1200"/>
-        <w:gridCol w:w="1200"/>
-        <w:gridCol w:w="1950"/>
-        <w:gridCol w:w="1950"/>
+        <w:gridCol w:w="4560"/>
+        <w:gridCol w:w="1500"/>
+        <w:gridCol w:w="1500"/>
+        <w:gridCol w:w="1800"/>
       </w:tblGrid>
       <w:tr>
         <w:trPr>
@@ -4290,7 +3334,7 @@
         </w:trPr>
         <w:tc>
           <w:tcPr>
-            <w:tcW w:type="dxa" w:w="3060"/>
+            <w:tcW w:type="dxa" w:w="4560"/>
             <w:tcBorders>
               <w:top w:val="single" w:color="D5DBE3" w:sz="4"/>
               <w:left w:val="single" w:color="D5DBE3" w:sz="4"/>
@@ -4325,7 +3369,7 @@
         </w:tc>
         <w:tc>
           <w:tcPr>
-            <w:tcW w:type="dxa" w:w="1200"/>
+            <w:tcW w:type="dxa" w:w="1500"/>
             <w:tcBorders>
               <w:top w:val="single" w:color="D5DBE3" w:sz="4"/>
               <w:left w:val="single" w:color="D5DBE3" w:sz="4"/>
@@ -4360,7 +3404,7 @@
         </w:tc>
         <w:tc>
           <w:tcPr>
-            <w:tcW w:type="dxa" w:w="1200"/>
+            <w:tcW w:type="dxa" w:w="1500"/>
             <w:tcBorders>
               <w:top w:val="single" w:color="D5DBE3" w:sz="4"/>
               <w:left w:val="single" w:color="D5DBE3" w:sz="4"/>
@@ -4395,7 +3439,7 @@
         </w:tc>
         <w:tc>
           <w:tcPr>
-            <w:tcW w:type="dxa" w:w="1950"/>
+            <w:tcW w:type="dxa" w:w="1800"/>
             <w:tcBorders>
               <w:top w:val="single" w:color="D5DBE3" w:sz="4"/>
               <w:left w:val="single" w:color="D5DBE3" w:sz="4"/>
@@ -4424,42 +3468,7 @@
                 <w:sz w:val="18"/>
                 <w:szCs w:val="18"/>
               </w:rPr>
-              <w:t xml:space="preserve">Direct answer</w:t>
-            </w:r>
-          </w:p>
-        </w:tc>
-        <w:tc>
-          <w:tcPr>
-            <w:tcW w:type="dxa" w:w="1950"/>
-            <w:tcBorders>
-              <w:top w:val="single" w:color="D5DBE3" w:sz="4"/>
-              <w:left w:val="single" w:color="D5DBE3" w:sz="4"/>
-              <w:bottom w:val="single" w:color="D5DBE3" w:sz="4"/>
-              <w:right w:val="single" w:color="D5DBE3" w:sz="4"/>
-            </w:tcBorders>
-            <w:shd w:fill="E8EDF3" w:color="auto" w:val="clear"/>
-            <w:tcMar>
-              <w:top w:type="dxa" w:w="48"/>
-              <w:left w:type="dxa" w:w="110"/>
-              <w:bottom w:type="dxa" w:w="48"/>
-              <w:right w:type="dxa" w:w="110"/>
-            </w:tcMar>
-          </w:tcPr>
-          <w:p>
-            <w:pPr>
-              <w:keepNext/>
-              <w:jc w:val="right"/>
-            </w:pPr>
-            <w:r>
-              <w:rPr>
-                <w:rFonts w:ascii="Calibri" w:cs="Calibri" w:eastAsia="Calibri" w:hAnsi="Calibri"/>
-                <w:b/>
-                <w:bCs/>
-                <w:color w:val="1B3A5C"/>
-                <w:sz w:val="18"/>
-                <w:szCs w:val="18"/>
-              </w:rPr>
-              <w:t xml:space="preserve">Reasons like GPT-5</w:t>
+              <w:t xml:space="preserve">Est. cost</w:t>
             </w:r>
           </w:p>
         </w:tc>
@@ -4470,7 +3479,7 @@
         </w:trPr>
         <w:tc>
           <w:tcPr>
-            <w:tcW w:type="dxa" w:w="3060"/>
+            <w:tcW w:type="dxa" w:w="4560"/>
             <w:tcBorders>
               <w:top w:val="single" w:color="D5DBE3" w:sz="4"/>
               <w:left w:val="single" w:color="D5DBE3" w:sz="4"/>
@@ -4502,7 +3511,7 @@
         </w:tc>
         <w:tc>
           <w:tcPr>
-            <w:tcW w:type="dxa" w:w="1200"/>
+            <w:tcW w:type="dxa" w:w="1500"/>
             <w:tcBorders>
               <w:top w:val="single" w:color="D5DBE3" w:sz="4"/>
               <w:left w:val="single" w:color="D5DBE3" w:sz="4"/>
@@ -4534,7 +3543,7 @@
         </w:tc>
         <w:tc>
           <w:tcPr>
-            <w:tcW w:type="dxa" w:w="1200"/>
+            <w:tcW w:type="dxa" w:w="1500"/>
             <w:tcBorders>
               <w:top w:val="single" w:color="D5DBE3" w:sz="4"/>
               <w:left w:val="single" w:color="D5DBE3" w:sz="4"/>
@@ -4566,39 +3575,7 @@
         </w:tc>
         <w:tc>
           <w:tcPr>
-            <w:tcW w:type="dxa" w:w="1950"/>
-            <w:tcBorders>
-              <w:top w:val="single" w:color="D5DBE3" w:sz="4"/>
-              <w:left w:val="single" w:color="D5DBE3" w:sz="4"/>
-              <w:bottom w:val="single" w:color="D5DBE3" w:sz="4"/>
-              <w:right w:val="single" w:color="D5DBE3" w:sz="4"/>
-            </w:tcBorders>
-            <w:tcMar>
-              <w:top w:type="dxa" w:w="48"/>
-              <w:left w:type="dxa" w:w="110"/>
-              <w:bottom w:type="dxa" w:w="48"/>
-              <w:right w:type="dxa" w:w="110"/>
-            </w:tcMar>
-          </w:tcPr>
-          <w:p>
-            <w:pPr>
-              <w:keepNext/>
-              <w:jc w:val="right"/>
-            </w:pPr>
-            <w:r>
-              <w:rPr>
-                <w:rFonts w:ascii="Calibri" w:cs="Calibri" w:eastAsia="Calibri" w:hAnsi="Calibri"/>
-                <w:color w:val="1F2A37"/>
-                <w:sz w:val="19"/>
-                <w:szCs w:val="19"/>
-              </w:rPr>
-              <w:t xml:space="preserve">$0.80</w:t>
-            </w:r>
-          </w:p>
-        </w:tc>
-        <w:tc>
-          <w:tcPr>
-            <w:tcW w:type="dxa" w:w="1950"/>
+            <w:tcW w:type="dxa" w:w="1800"/>
             <w:tcBorders>
               <w:top w:val="single" w:color="D5DBE3" w:sz="4"/>
               <w:left w:val="single" w:color="D5DBE3" w:sz="4"/>
@@ -4637,7 +3614,7 @@
         </w:trPr>
         <w:tc>
           <w:tcPr>
-            <w:tcW w:type="dxa" w:w="3060"/>
+            <w:tcW w:type="dxa" w:w="4560"/>
             <w:tcBorders>
               <w:top w:val="single" w:color="D5DBE3" w:sz="4"/>
               <w:left w:val="single" w:color="D5DBE3" w:sz="4"/>
@@ -4670,7 +3647,7 @@
         </w:tc>
         <w:tc>
           <w:tcPr>
-            <w:tcW w:type="dxa" w:w="1200"/>
+            <w:tcW w:type="dxa" w:w="1500"/>
             <w:tcBorders>
               <w:top w:val="single" w:color="D5DBE3" w:sz="4"/>
               <w:left w:val="single" w:color="D5DBE3" w:sz="4"/>
@@ -4703,7 +3680,7 @@
         </w:tc>
         <w:tc>
           <w:tcPr>
-            <w:tcW w:type="dxa" w:w="1200"/>
+            <w:tcW w:type="dxa" w:w="1500"/>
             <w:tcBorders>
               <w:top w:val="single" w:color="D5DBE3" w:sz="4"/>
               <w:left w:val="single" w:color="D5DBE3" w:sz="4"/>
@@ -4736,40 +3713,7 @@
         </w:tc>
         <w:tc>
           <w:tcPr>
-            <w:tcW w:type="dxa" w:w="1950"/>
-            <w:tcBorders>
-              <w:top w:val="single" w:color="D5DBE3" w:sz="4"/>
-              <w:left w:val="single" w:color="D5DBE3" w:sz="4"/>
-              <w:bottom w:val="single" w:color="D5DBE3" w:sz="4"/>
-              <w:right w:val="single" w:color="D5DBE3" w:sz="4"/>
-            </w:tcBorders>
-            <w:shd w:fill="F7F9FB" w:color="auto" w:val="clear"/>
-            <w:tcMar>
-              <w:top w:type="dxa" w:w="48"/>
-              <w:left w:type="dxa" w:w="110"/>
-              <w:bottom w:type="dxa" w:w="48"/>
-              <w:right w:type="dxa" w:w="110"/>
-            </w:tcMar>
-          </w:tcPr>
-          <w:p>
-            <w:pPr>
-              <w:keepNext/>
-              <w:jc w:val="right"/>
-            </w:pPr>
-            <w:r>
-              <w:rPr>
-                <w:rFonts w:ascii="Calibri" w:cs="Calibri" w:eastAsia="Calibri" w:hAnsi="Calibri"/>
-                <w:color w:val="1F2A37"/>
-                <w:sz w:val="19"/>
-                <w:szCs w:val="19"/>
-              </w:rPr>
-              <w:t xml:space="preserve">$2.92</w:t>
-            </w:r>
-          </w:p>
-        </w:tc>
-        <w:tc>
-          <w:tcPr>
-            <w:tcW w:type="dxa" w:w="1950"/>
+            <w:tcW w:type="dxa" w:w="1800"/>
             <w:tcBorders>
               <w:top w:val="single" w:color="D5DBE3" w:sz="4"/>
               <w:left w:val="single" w:color="D5DBE3" w:sz="4"/>
@@ -4809,7 +3753,7 @@
         </w:trPr>
         <w:tc>
           <w:tcPr>
-            <w:tcW w:type="dxa" w:w="3060"/>
+            <w:tcW w:type="dxa" w:w="4560"/>
             <w:tcBorders>
               <w:top w:val="single" w:color="D5DBE3" w:sz="4"/>
               <w:left w:val="single" w:color="D5DBE3" w:sz="4"/>
@@ -4841,7 +3785,7 @@
         </w:tc>
         <w:tc>
           <w:tcPr>
-            <w:tcW w:type="dxa" w:w="1200"/>
+            <w:tcW w:type="dxa" w:w="1500"/>
             <w:tcBorders>
               <w:top w:val="single" w:color="D5DBE3" w:sz="4"/>
               <w:left w:val="single" w:color="D5DBE3" w:sz="4"/>
@@ -4873,7 +3817,7 @@
         </w:tc>
         <w:tc>
           <w:tcPr>
-            <w:tcW w:type="dxa" w:w="1200"/>
+            <w:tcW w:type="dxa" w:w="1500"/>
             <w:tcBorders>
               <w:top w:val="single" w:color="D5DBE3" w:sz="4"/>
               <w:left w:val="single" w:color="D5DBE3" w:sz="4"/>
@@ -4905,39 +3849,7 @@
         </w:tc>
         <w:tc>
           <w:tcPr>
-            <w:tcW w:type="dxa" w:w="1950"/>
-            <w:tcBorders>
-              <w:top w:val="single" w:color="D5DBE3" w:sz="4"/>
-              <w:left w:val="single" w:color="D5DBE3" w:sz="4"/>
-              <w:bottom w:val="single" w:color="D5DBE3" w:sz="4"/>
-              <w:right w:val="single" w:color="D5DBE3" w:sz="4"/>
-            </w:tcBorders>
-            <w:tcMar>
-              <w:top w:type="dxa" w:w="48"/>
-              <w:left w:type="dxa" w:w="110"/>
-              <w:bottom w:type="dxa" w:w="48"/>
-              <w:right w:type="dxa" w:w="110"/>
-            </w:tcMar>
-          </w:tcPr>
-          <w:p>
-            <w:pPr>
-              <w:keepNext/>
-              <w:jc w:val="right"/>
-            </w:pPr>
-            <w:r>
-              <w:rPr>
-                <w:rFonts w:ascii="Calibri" w:cs="Calibri" w:eastAsia="Calibri" w:hAnsi="Calibri"/>
-                <w:color w:val="1F2A37"/>
-                <w:sz w:val="19"/>
-                <w:szCs w:val="19"/>
-              </w:rPr>
-              <w:t xml:space="preserve">$4.79</w:t>
-            </w:r>
-          </w:p>
-        </w:tc>
-        <w:tc>
-          <w:tcPr>
-            <w:tcW w:type="dxa" w:w="1950"/>
+            <w:tcW w:type="dxa" w:w="1800"/>
             <w:tcBorders>
               <w:top w:val="single" w:color="D5DBE3" w:sz="4"/>
               <w:left w:val="single" w:color="D5DBE3" w:sz="4"/>
@@ -4976,7 +3888,7 @@
         </w:trPr>
         <w:tc>
           <w:tcPr>
-            <w:tcW w:type="dxa" w:w="3060"/>
+            <w:tcW w:type="dxa" w:w="4560"/>
             <w:tcBorders>
               <w:top w:val="single" w:color="D5DBE3" w:sz="4"/>
               <w:left w:val="single" w:color="D5DBE3" w:sz="4"/>
@@ -5009,7 +3921,7 @@
         </w:tc>
         <w:tc>
           <w:tcPr>
-            <w:tcW w:type="dxa" w:w="1200"/>
+            <w:tcW w:type="dxa" w:w="1500"/>
             <w:tcBorders>
               <w:top w:val="single" w:color="D5DBE3" w:sz="4"/>
               <w:left w:val="single" w:color="D5DBE3" w:sz="4"/>
@@ -5042,7 +3954,7 @@
         </w:tc>
         <w:tc>
           <w:tcPr>
-            <w:tcW w:type="dxa" w:w="1200"/>
+            <w:tcW w:type="dxa" w:w="1500"/>
             <w:tcBorders>
               <w:top w:val="single" w:color="D5DBE3" w:sz="4"/>
               <w:left w:val="single" w:color="D5DBE3" w:sz="4"/>
@@ -5075,40 +3987,7 @@
         </w:tc>
         <w:tc>
           <w:tcPr>
-            <w:tcW w:type="dxa" w:w="1950"/>
-            <w:tcBorders>
-              <w:top w:val="single" w:color="D5DBE3" w:sz="4"/>
-              <w:left w:val="single" w:color="D5DBE3" w:sz="4"/>
-              <w:bottom w:val="single" w:color="D5DBE3" w:sz="4"/>
-              <w:right w:val="single" w:color="D5DBE3" w:sz="4"/>
-            </w:tcBorders>
-            <w:shd w:fill="F7F9FB" w:color="auto" w:val="clear"/>
-            <w:tcMar>
-              <w:top w:type="dxa" w:w="48"/>
-              <w:left w:type="dxa" w:w="110"/>
-              <w:bottom w:type="dxa" w:w="48"/>
-              <w:right w:type="dxa" w:w="110"/>
-            </w:tcMar>
-          </w:tcPr>
-          <w:p>
-            <w:pPr>
-              <w:keepNext/>
-              <w:jc w:val="right"/>
-            </w:pPr>
-            <w:r>
-              <w:rPr>
-                <w:rFonts w:ascii="Calibri" w:cs="Calibri" w:eastAsia="Calibri" w:hAnsi="Calibri"/>
-                <w:color w:val="1F2A37"/>
-                <w:sz w:val="19"/>
-                <w:szCs w:val="19"/>
-              </w:rPr>
-              <w:t xml:space="preserve">$7.40</w:t>
-            </w:r>
-          </w:p>
-        </w:tc>
-        <w:tc>
-          <w:tcPr>
-            <w:tcW w:type="dxa" w:w="1950"/>
+            <w:tcW w:type="dxa" w:w="1800"/>
             <w:tcBorders>
               <w:top w:val="single" w:color="D5DBE3" w:sz="4"/>
               <w:left w:val="single" w:color="D5DBE3" w:sz="4"/>
@@ -5148,7 +4027,7 @@
         </w:trPr>
         <w:tc>
           <w:tcPr>
-            <w:tcW w:type="dxa" w:w="3060"/>
+            <w:tcW w:type="dxa" w:w="4560"/>
             <w:tcBorders>
               <w:top w:val="single" w:color="D5DBE3" w:sz="4"/>
               <w:left w:val="single" w:color="D5DBE3" w:sz="4"/>
@@ -5180,7 +4059,7 @@
         </w:tc>
         <w:tc>
           <w:tcPr>
-            <w:tcW w:type="dxa" w:w="1200"/>
+            <w:tcW w:type="dxa" w:w="1500"/>
             <w:tcBorders>
               <w:top w:val="single" w:color="D5DBE3" w:sz="4"/>
               <w:left w:val="single" w:color="D5DBE3" w:sz="4"/>
@@ -5212,7 +4091,7 @@
         </w:tc>
         <w:tc>
           <w:tcPr>
-            <w:tcW w:type="dxa" w:w="1200"/>
+            <w:tcW w:type="dxa" w:w="1500"/>
             <w:tcBorders>
               <w:top w:val="single" w:color="D5DBE3" w:sz="4"/>
               <w:left w:val="single" w:color="D5DBE3" w:sz="4"/>
@@ -5244,39 +4123,7 @@
         </w:tc>
         <w:tc>
           <w:tcPr>
-            <w:tcW w:type="dxa" w:w="1950"/>
-            <w:tcBorders>
-              <w:top w:val="single" w:color="D5DBE3" w:sz="4"/>
-              <w:left w:val="single" w:color="D5DBE3" w:sz="4"/>
-              <w:bottom w:val="single" w:color="D5DBE3" w:sz="4"/>
-              <w:right w:val="single" w:color="D5DBE3" w:sz="4"/>
-            </w:tcBorders>
-            <w:tcMar>
-              <w:top w:type="dxa" w:w="48"/>
-              <w:left w:type="dxa" w:w="110"/>
-              <w:bottom w:type="dxa" w:w="48"/>
-              <w:right w:type="dxa" w:w="110"/>
-            </w:tcMar>
-          </w:tcPr>
-          <w:p>
-            <w:pPr>
-              <w:keepNext/>
-              <w:jc w:val="right"/>
-            </w:pPr>
-            <w:r>
-              <w:rPr>
-                <w:rFonts w:ascii="Calibri" w:cs="Calibri" w:eastAsia="Calibri" w:hAnsi="Calibri"/>
-                <w:color w:val="1F2A37"/>
-                <w:sz w:val="19"/>
-                <w:szCs w:val="19"/>
-              </w:rPr>
-              <w:t xml:space="preserve">$19</w:t>
-            </w:r>
-          </w:p>
-        </w:tc>
-        <w:tc>
-          <w:tcPr>
-            <w:tcW w:type="dxa" w:w="1950"/>
+            <w:tcW w:type="dxa" w:w="1800"/>
             <w:tcBorders>
               <w:top w:val="single" w:color="D5DBE3" w:sz="4"/>
               <w:left w:val="single" w:color="D5DBE3" w:sz="4"/>
@@ -5315,7 +4162,7 @@
         </w:trPr>
         <w:tc>
           <w:tcPr>
-            <w:tcW w:type="dxa" w:w="3060"/>
+            <w:tcW w:type="dxa" w:w="4560"/>
             <w:tcBorders>
               <w:top w:val="single" w:color="D5DBE3" w:sz="4"/>
               <w:left w:val="single" w:color="D5DBE3" w:sz="4"/>
@@ -5348,7 +4195,7 @@
         </w:tc>
         <w:tc>
           <w:tcPr>
-            <w:tcW w:type="dxa" w:w="1200"/>
+            <w:tcW w:type="dxa" w:w="1500"/>
             <w:tcBorders>
               <w:top w:val="single" w:color="D5DBE3" w:sz="4"/>
               <w:left w:val="single" w:color="D5DBE3" w:sz="4"/>
@@ -5381,7 +4228,7 @@
         </w:tc>
         <w:tc>
           <w:tcPr>
-            <w:tcW w:type="dxa" w:w="1200"/>
+            <w:tcW w:type="dxa" w:w="1500"/>
             <w:tcBorders>
               <w:top w:val="single" w:color="D5DBE3" w:sz="4"/>
               <w:left w:val="single" w:color="D5DBE3" w:sz="4"/>
@@ -5414,40 +4261,7 @@
         </w:tc>
         <w:tc>
           <w:tcPr>
-            <w:tcW w:type="dxa" w:w="1950"/>
-            <w:tcBorders>
-              <w:top w:val="single" w:color="D5DBE3" w:sz="4"/>
-              <w:left w:val="single" w:color="D5DBE3" w:sz="4"/>
-              <w:bottom w:val="single" w:color="D5DBE3" w:sz="4"/>
-              <w:right w:val="single" w:color="D5DBE3" w:sz="4"/>
-            </w:tcBorders>
-            <w:shd w:fill="F7F9FB" w:color="auto" w:val="clear"/>
-            <w:tcMar>
-              <w:top w:type="dxa" w:w="48"/>
-              <w:left w:type="dxa" w:w="110"/>
-              <w:bottom w:type="dxa" w:w="48"/>
-              <w:right w:type="dxa" w:w="110"/>
-            </w:tcMar>
-          </w:tcPr>
-          <w:p>
-            <w:pPr>
-              <w:keepNext/>
-              <w:jc w:val="right"/>
-            </w:pPr>
-            <w:r>
-              <w:rPr>
-                <w:rFonts w:ascii="Calibri" w:cs="Calibri" w:eastAsia="Calibri" w:hAnsi="Calibri"/>
-                <w:color w:val="1F2A37"/>
-                <w:sz w:val="19"/>
-                <w:szCs w:val="19"/>
-              </w:rPr>
-              <w:t xml:space="preserve">$18</w:t>
-            </w:r>
-          </w:p>
-        </w:tc>
-        <w:tc>
-          <w:tcPr>
-            <w:tcW w:type="dxa" w:w="1950"/>
+            <w:tcW w:type="dxa" w:w="1800"/>
             <w:tcBorders>
               <w:top w:val="single" w:color="D5DBE3" w:sz="4"/>
               <w:left w:val="single" w:color="D5DBE3" w:sz="4"/>
@@ -5487,7 +4301,7 @@
         </w:trPr>
         <w:tc>
           <w:tcPr>
-            <w:tcW w:type="dxa" w:w="3060"/>
+            <w:tcW w:type="dxa" w:w="4560"/>
             <w:tcBorders>
               <w:top w:val="single" w:color="D5DBE3" w:sz="4"/>
               <w:left w:val="single" w:color="D5DBE3" w:sz="4"/>
@@ -5519,7 +4333,7 @@
         </w:tc>
         <w:tc>
           <w:tcPr>
-            <w:tcW w:type="dxa" w:w="1200"/>
+            <w:tcW w:type="dxa" w:w="1500"/>
             <w:tcBorders>
               <w:top w:val="single" w:color="D5DBE3" w:sz="4"/>
               <w:left w:val="single" w:color="D5DBE3" w:sz="4"/>
@@ -5551,7 +4365,7 @@
         </w:tc>
         <w:tc>
           <w:tcPr>
-            <w:tcW w:type="dxa" w:w="1200"/>
+            <w:tcW w:type="dxa" w:w="1500"/>
             <w:tcBorders>
               <w:top w:val="single" w:color="D5DBE3" w:sz="4"/>
               <w:left w:val="single" w:color="D5DBE3" w:sz="4"/>
@@ -5583,39 +4397,7 @@
         </w:tc>
         <w:tc>
           <w:tcPr>
-            <w:tcW w:type="dxa" w:w="1950"/>
-            <w:tcBorders>
-              <w:top w:val="single" w:color="D5DBE3" w:sz="4"/>
-              <w:left w:val="single" w:color="D5DBE3" w:sz="4"/>
-              <w:bottom w:val="single" w:color="D5DBE3" w:sz="4"/>
-              <w:right w:val="single" w:color="D5DBE3" w:sz="4"/>
-            </w:tcBorders>
-            <w:tcMar>
-              <w:top w:type="dxa" w:w="48"/>
-              <w:left w:type="dxa" w:w="110"/>
-              <w:bottom w:type="dxa" w:w="48"/>
-              <w:right w:type="dxa" w:w="110"/>
-            </w:tcMar>
-          </w:tcPr>
-          <w:p>
-            <w:pPr>
-              <w:keepNext w:val="false"/>
-              <w:jc w:val="right"/>
-            </w:pPr>
-            <w:r>
-              <w:rPr>
-                <w:rFonts w:ascii="Calibri" w:cs="Calibri" w:eastAsia="Calibri" w:hAnsi="Calibri"/>
-                <w:color w:val="1F2A37"/>
-                <w:sz w:val="19"/>
-                <w:szCs w:val="19"/>
-              </w:rPr>
-              <w:t xml:space="preserve">$23</w:t>
-            </w:r>
-          </w:p>
-        </w:tc>
-        <w:tc>
-          <w:tcPr>
-            <w:tcW w:type="dxa" w:w="1950"/>
+            <w:tcW w:type="dxa" w:w="1800"/>
             <w:tcBorders>
               <w:top w:val="single" w:color="D5DBE3" w:sz="4"/>
               <w:left w:val="single" w:color="D5DBE3" w:sz="4"/>
@@ -5680,11 +4462,10 @@
         </w:tblBorders>
       </w:tblPr>
       <w:tblGrid>
-        <w:gridCol w:w="3060"/>
-        <w:gridCol w:w="1200"/>
-        <w:gridCol w:w="1200"/>
-        <w:gridCol w:w="1950"/>
-        <w:gridCol w:w="1950"/>
+        <w:gridCol w:w="4560"/>
+        <w:gridCol w:w="1500"/>
+        <w:gridCol w:w="1500"/>
+        <w:gridCol w:w="1800"/>
       </w:tblGrid>
       <w:tr>
         <w:trPr>
@@ -5693,7 +4474,7 @@
         </w:trPr>
         <w:tc>
           <w:tcPr>
-            <w:tcW w:type="dxa" w:w="3060"/>
+            <w:tcW w:type="dxa" w:w="4560"/>
             <w:tcBorders>
               <w:top w:val="single" w:color="D5DBE3" w:sz="4"/>
               <w:left w:val="single" w:color="D5DBE3" w:sz="4"/>
@@ -5728,7 +4509,7 @@
         </w:tc>
         <w:tc>
           <w:tcPr>
-            <w:tcW w:type="dxa" w:w="1200"/>
+            <w:tcW w:type="dxa" w:w="1500"/>
             <w:tcBorders>
               <w:top w:val="single" w:color="D5DBE3" w:sz="4"/>
               <w:left w:val="single" w:color="D5DBE3" w:sz="4"/>
@@ -5763,7 +4544,7 @@
         </w:tc>
         <w:tc>
           <w:tcPr>
-            <w:tcW w:type="dxa" w:w="1200"/>
+            <w:tcW w:type="dxa" w:w="1500"/>
             <w:tcBorders>
               <w:top w:val="single" w:color="D5DBE3" w:sz="4"/>
               <w:left w:val="single" w:color="D5DBE3" w:sz="4"/>
@@ -5798,7 +4579,7 @@
         </w:tc>
         <w:tc>
           <w:tcPr>
-            <w:tcW w:type="dxa" w:w="1950"/>
+            <w:tcW w:type="dxa" w:w="1800"/>
             <w:tcBorders>
               <w:top w:val="single" w:color="D5DBE3" w:sz="4"/>
               <w:left w:val="single" w:color="D5DBE3" w:sz="4"/>
@@ -5827,42 +4608,7 @@
                 <w:sz w:val="18"/>
                 <w:szCs w:val="18"/>
               </w:rPr>
-              <w:t xml:space="preserve">Direct answer</w:t>
-            </w:r>
-          </w:p>
-        </w:tc>
-        <w:tc>
-          <w:tcPr>
-            <w:tcW w:type="dxa" w:w="1950"/>
-            <w:tcBorders>
-              <w:top w:val="single" w:color="D5DBE3" w:sz="4"/>
-              <w:left w:val="single" w:color="D5DBE3" w:sz="4"/>
-              <w:bottom w:val="single" w:color="D5DBE3" w:sz="4"/>
-              <w:right w:val="single" w:color="D5DBE3" w:sz="4"/>
-            </w:tcBorders>
-            <w:shd w:fill="E8EDF3" w:color="auto" w:val="clear"/>
-            <w:tcMar>
-              <w:top w:type="dxa" w:w="48"/>
-              <w:left w:type="dxa" w:w="110"/>
-              <w:bottom w:type="dxa" w:w="48"/>
-              <w:right w:type="dxa" w:w="110"/>
-            </w:tcMar>
-          </w:tcPr>
-          <w:p>
-            <w:pPr>
-              <w:keepNext/>
-              <w:jc w:val="right"/>
-            </w:pPr>
-            <w:r>
-              <w:rPr>
-                <w:rFonts w:ascii="Calibri" w:cs="Calibri" w:eastAsia="Calibri" w:hAnsi="Calibri"/>
-                <w:b/>
-                <w:bCs/>
-                <w:color w:val="1B3A5C"/>
-                <w:sz w:val="18"/>
-                <w:szCs w:val="18"/>
-              </w:rPr>
-              <w:t xml:space="preserve">Reasons like GPT-5</w:t>
+              <w:t xml:space="preserve">Est. cost</w:t>
             </w:r>
           </w:p>
         </w:tc>
@@ -5873,7 +4619,7 @@
         </w:trPr>
         <w:tc>
           <w:tcPr>
-            <w:tcW w:type="dxa" w:w="3060"/>
+            <w:tcW w:type="dxa" w:w="4560"/>
             <w:tcBorders>
               <w:top w:val="single" w:color="D5DBE3" w:sz="4"/>
               <w:left w:val="single" w:color="D5DBE3" w:sz="4"/>
@@ -5905,7 +4651,7 @@
         </w:tc>
         <w:tc>
           <w:tcPr>
-            <w:tcW w:type="dxa" w:w="1200"/>
+            <w:tcW w:type="dxa" w:w="1500"/>
             <w:tcBorders>
               <w:top w:val="single" w:color="D5DBE3" w:sz="4"/>
               <w:left w:val="single" w:color="D5DBE3" w:sz="4"/>
@@ -5937,7 +4683,7 @@
         </w:tc>
         <w:tc>
           <w:tcPr>
-            <w:tcW w:type="dxa" w:w="1200"/>
+            <w:tcW w:type="dxa" w:w="1500"/>
             <w:tcBorders>
               <w:top w:val="single" w:color="D5DBE3" w:sz="4"/>
               <w:left w:val="single" w:color="D5DBE3" w:sz="4"/>
@@ -5969,39 +4715,7 @@
         </w:tc>
         <w:tc>
           <w:tcPr>
-            <w:tcW w:type="dxa" w:w="1950"/>
-            <w:tcBorders>
-              <w:top w:val="single" w:color="D5DBE3" w:sz="4"/>
-              <w:left w:val="single" w:color="D5DBE3" w:sz="4"/>
-              <w:bottom w:val="single" w:color="D5DBE3" w:sz="4"/>
-              <w:right w:val="single" w:color="D5DBE3" w:sz="4"/>
-            </w:tcBorders>
-            <w:tcMar>
-              <w:top w:type="dxa" w:w="48"/>
-              <w:left w:type="dxa" w:w="110"/>
-              <w:bottom w:type="dxa" w:w="48"/>
-              <w:right w:type="dxa" w:w="110"/>
-            </w:tcMar>
-          </w:tcPr>
-          <w:p>
-            <w:pPr>
-              <w:keepNext/>
-              <w:jc w:val="right"/>
-            </w:pPr>
-            <w:r>
-              <w:rPr>
-                <w:rFonts w:ascii="Calibri" w:cs="Calibri" w:eastAsia="Calibri" w:hAnsi="Calibri"/>
-                <w:color w:val="1F2A37"/>
-                <w:sz w:val="19"/>
-                <w:szCs w:val="19"/>
-              </w:rPr>
-              <w:t xml:space="preserve">$9.86</w:t>
-            </w:r>
-          </w:p>
-        </w:tc>
-        <w:tc>
-          <w:tcPr>
-            <w:tcW w:type="dxa" w:w="1950"/>
+            <w:tcW w:type="dxa" w:w="1800"/>
             <w:tcBorders>
               <w:top w:val="single" w:color="D5DBE3" w:sz="4"/>
               <w:left w:val="single" w:color="D5DBE3" w:sz="4"/>
@@ -6040,7 +4754,7 @@
         </w:trPr>
         <w:tc>
           <w:tcPr>
-            <w:tcW w:type="dxa" w:w="3060"/>
+            <w:tcW w:type="dxa" w:w="4560"/>
             <w:tcBorders>
               <w:top w:val="single" w:color="D5DBE3" w:sz="4"/>
               <w:left w:val="single" w:color="D5DBE3" w:sz="4"/>
@@ -6073,7 +4787,7 @@
         </w:tc>
         <w:tc>
           <w:tcPr>
-            <w:tcW w:type="dxa" w:w="1200"/>
+            <w:tcW w:type="dxa" w:w="1500"/>
             <w:tcBorders>
               <w:top w:val="single" w:color="D5DBE3" w:sz="4"/>
               <w:left w:val="single" w:color="D5DBE3" w:sz="4"/>
@@ -6106,7 +4820,7 @@
         </w:tc>
         <w:tc>
           <w:tcPr>
-            <w:tcW w:type="dxa" w:w="1200"/>
+            <w:tcW w:type="dxa" w:w="1500"/>
             <w:tcBorders>
               <w:top w:val="single" w:color="D5DBE3" w:sz="4"/>
               <w:left w:val="single" w:color="D5DBE3" w:sz="4"/>
@@ -6139,40 +4853,7 @@
         </w:tc>
         <w:tc>
           <w:tcPr>
-            <w:tcW w:type="dxa" w:w="1950"/>
-            <w:tcBorders>
-              <w:top w:val="single" w:color="D5DBE3" w:sz="4"/>
-              <w:left w:val="single" w:color="D5DBE3" w:sz="4"/>
-              <w:bottom w:val="single" w:color="D5DBE3" w:sz="4"/>
-              <w:right w:val="single" w:color="D5DBE3" w:sz="4"/>
-            </w:tcBorders>
-            <w:shd w:fill="F7F9FB" w:color="auto" w:val="clear"/>
-            <w:tcMar>
-              <w:top w:type="dxa" w:w="48"/>
-              <w:left w:type="dxa" w:w="110"/>
-              <w:bottom w:type="dxa" w:w="48"/>
-              <w:right w:type="dxa" w:w="110"/>
-            </w:tcMar>
-          </w:tcPr>
-          <w:p>
-            <w:pPr>
-              <w:keepNext/>
-              <w:jc w:val="right"/>
-            </w:pPr>
-            <w:r>
-              <w:rPr>
-                <w:rFonts w:ascii="Calibri" w:cs="Calibri" w:eastAsia="Calibri" w:hAnsi="Calibri"/>
-                <w:color w:val="1F2A37"/>
-                <w:sz w:val="19"/>
-                <w:szCs w:val="19"/>
-              </w:rPr>
-              <w:t xml:space="preserve">$20</w:t>
-            </w:r>
-          </w:p>
-        </w:tc>
-        <w:tc>
-          <w:tcPr>
-            <w:tcW w:type="dxa" w:w="1950"/>
+            <w:tcW w:type="dxa" w:w="1800"/>
             <w:tcBorders>
               <w:top w:val="single" w:color="D5DBE3" w:sz="4"/>
               <w:left w:val="single" w:color="D5DBE3" w:sz="4"/>
@@ -6212,7 +4893,7 @@
         </w:trPr>
         <w:tc>
           <w:tcPr>
-            <w:tcW w:type="dxa" w:w="3060"/>
+            <w:tcW w:type="dxa" w:w="4560"/>
             <w:tcBorders>
               <w:top w:val="single" w:color="D5DBE3" w:sz="4"/>
               <w:left w:val="single" w:color="D5DBE3" w:sz="4"/>
@@ -6244,7 +4925,7 @@
         </w:tc>
         <w:tc>
           <w:tcPr>
-            <w:tcW w:type="dxa" w:w="1200"/>
+            <w:tcW w:type="dxa" w:w="1500"/>
             <w:tcBorders>
               <w:top w:val="single" w:color="D5DBE3" w:sz="4"/>
               <w:left w:val="single" w:color="D5DBE3" w:sz="4"/>
@@ -6276,7 +4957,7 @@
         </w:tc>
         <w:tc>
           <w:tcPr>
-            <w:tcW w:type="dxa" w:w="1200"/>
+            <w:tcW w:type="dxa" w:w="1500"/>
             <w:tcBorders>
               <w:top w:val="single" w:color="D5DBE3" w:sz="4"/>
               <w:left w:val="single" w:color="D5DBE3" w:sz="4"/>
@@ -6308,39 +4989,7 @@
         </w:tc>
         <w:tc>
           <w:tcPr>
-            <w:tcW w:type="dxa" w:w="1950"/>
-            <w:tcBorders>
-              <w:top w:val="single" w:color="D5DBE3" w:sz="4"/>
-              <w:left w:val="single" w:color="D5DBE3" w:sz="4"/>
-              <w:bottom w:val="single" w:color="D5DBE3" w:sz="4"/>
-              <w:right w:val="single" w:color="D5DBE3" w:sz="4"/>
-            </w:tcBorders>
-            <w:tcMar>
-              <w:top w:type="dxa" w:w="48"/>
-              <w:left w:type="dxa" w:w="110"/>
-              <w:bottom w:type="dxa" w:w="48"/>
-              <w:right w:type="dxa" w:w="110"/>
-            </w:tcMar>
-          </w:tcPr>
-          <w:p>
-            <w:pPr>
-              <w:keepNext/>
-              <w:jc w:val="right"/>
-            </w:pPr>
-            <w:r>
-              <w:rPr>
-                <w:rFonts w:ascii="Calibri" w:cs="Calibri" w:eastAsia="Calibri" w:hAnsi="Calibri"/>
-                <w:color w:val="1F2A37"/>
-                <w:sz w:val="19"/>
-                <w:szCs w:val="19"/>
-              </w:rPr>
-              <w:t xml:space="preserve">$49</w:t>
-            </w:r>
-          </w:p>
-        </w:tc>
-        <w:tc>
-          <w:tcPr>
-            <w:tcW w:type="dxa" w:w="1950"/>
+            <w:tcW w:type="dxa" w:w="1800"/>
             <w:tcBorders>
               <w:top w:val="single" w:color="D5DBE3" w:sz="4"/>
               <w:left w:val="single" w:color="D5DBE3" w:sz="4"/>
@@ -6379,7 +5028,7 @@
         </w:trPr>
         <w:tc>
           <w:tcPr>
-            <w:tcW w:type="dxa" w:w="3060"/>
+            <w:tcW w:type="dxa" w:w="4560"/>
             <w:tcBorders>
               <w:top w:val="single" w:color="D5DBE3" w:sz="4"/>
               <w:left w:val="single" w:color="D5DBE3" w:sz="4"/>
@@ -6412,7 +5061,7 @@
         </w:tc>
         <w:tc>
           <w:tcPr>
-            <w:tcW w:type="dxa" w:w="1200"/>
+            <w:tcW w:type="dxa" w:w="1500"/>
             <w:tcBorders>
               <w:top w:val="single" w:color="D5DBE3" w:sz="4"/>
               <w:left w:val="single" w:color="D5DBE3" w:sz="4"/>
@@ -6445,7 +5094,7 @@
         </w:tc>
         <w:tc>
           <w:tcPr>
-            <w:tcW w:type="dxa" w:w="1200"/>
+            <w:tcW w:type="dxa" w:w="1500"/>
             <w:tcBorders>
               <w:top w:val="single" w:color="D5DBE3" w:sz="4"/>
               <w:left w:val="single" w:color="D5DBE3" w:sz="4"/>
@@ -6478,40 +5127,7 @@
         </w:tc>
         <w:tc>
           <w:tcPr>
-            <w:tcW w:type="dxa" w:w="1950"/>
-            <w:tcBorders>
-              <w:top w:val="single" w:color="D5DBE3" w:sz="4"/>
-              <w:left w:val="single" w:color="D5DBE3" w:sz="4"/>
-              <w:bottom w:val="single" w:color="D5DBE3" w:sz="4"/>
-              <w:right w:val="single" w:color="D5DBE3" w:sz="4"/>
-            </w:tcBorders>
-            <w:shd w:fill="F7F9FB" w:color="auto" w:val="clear"/>
-            <w:tcMar>
-              <w:top w:type="dxa" w:w="48"/>
-              <w:left w:type="dxa" w:w="110"/>
-              <w:bottom w:type="dxa" w:w="48"/>
-              <w:right w:type="dxa" w:w="110"/>
-            </w:tcMar>
-          </w:tcPr>
-          <w:p>
-            <w:pPr>
-              <w:keepNext w:val="false"/>
-              <w:jc w:val="right"/>
-            </w:pPr>
-            <w:r>
-              <w:rPr>
-                <w:rFonts w:ascii="Calibri" w:cs="Calibri" w:eastAsia="Calibri" w:hAnsi="Calibri"/>
-                <w:color w:val="1F2A37"/>
-                <w:sz w:val="19"/>
-                <w:szCs w:val="19"/>
-              </w:rPr>
-              <w:t xml:space="preserve">$99</w:t>
-            </w:r>
-          </w:p>
-        </w:tc>
-        <w:tc>
-          <w:tcPr>
-            <w:tcW w:type="dxa" w:w="1950"/>
+            <w:tcW w:type="dxa" w:w="1800"/>
             <w:tcBorders>
               <w:top w:val="single" w:color="D5DBE3" w:sz="4"/>
               <w:left w:val="single" w:color="D5DBE3" w:sz="4"/>
@@ -6593,7 +5209,7 @@
           <w:sz w:val="20"/>
           <w:szCs w:val="20"/>
         </w:rPr>
-        <w:t xml:space="preserve">Cost = 2,250 × (input tokens × input price + output tokens × output price) ÷ 1,000,000.</w:t>
+        <w:t xml:space="preserve">Est. cost = 2,250 × (input tokens × input price + output tokens × output price) ÷ 1,000,000, the full cost of all 2,250 runs.</w:t>
       </w:r>
     </w:p>
     <w:p>
@@ -6612,7 +5228,7 @@
           <w:sz w:val="20"/>
           <w:szCs w:val="20"/>
         </w:rPr>
-        <w:t xml:space="preserve">Token counts come from the pilot’s answers to 60 items covering all five branches and all three difficulty levels, under the benchmark’s own prompt.</w:t>
+        <w:t xml:space="preserve">It assumes each model writes as much as GPT-5 did in EngTrace’s evaluator pilot: about 270 input and 5,232 output tokens per problem, reasoning included. A model that answers without reasoning writes about 800 output tokens and would cost roughly a sixth of the figure shown.</w:t>
       </w:r>
     </w:p>
     <w:p>
@@ -6631,7 +5247,7 @@
           <w:sz w:val="20"/>
           <w:szCs w:val="20"/>
         </w:rPr>
-        <w:t xml:space="preserve">Re-runs after truncated or failed answers are not included; the pilot needed 0–15% extra for most models and up to 45% for a model whose reasoning ran away.</w:t>
+        <w:t xml:space="preserve">Not included: re-runs of truncated or failed answers (0–15% extra for most models in the pilot) and half-price batch endpoints.</w:t>
       </w:r>
     </w:p>
     <w:p>
@@ -6650,7 +5266,7 @@
           <w:sz w:val="20"/>
           <w:szCs w:val="20"/>
         </w:rPr>
-        <w:t xml:space="preserve">Half-price batch endpoints, where a provider offers them, would roughly halve the frontier rows.</w:t>
+        <w:t xml:space="preserve">Prices as read on OpenRouter, 19–21 September 2026; they move between upstreams from day to day.</w:t>
       </w:r>
     </w:p>
     <w:sectPr>

</xml_diff>

<commit_message>
Pricing document: fuller intro, costs to the cent, verified against the source list
</commit_message>
<xml_diff>
--- a/docs/inference_pricing/EngTrace-inference-pricing.docx
+++ b/docs/inference_pricing/EngTrace-inference-pricing.docx
@@ -30,7 +30,7 @@
           <w:sz w:val="21"/>
           <w:szCs w:val="21"/>
         </w:rPr>
-        <w:t xml:space="preserve">Inference is each model solving every EngTrace problem once: 150 templates × 15 instances = 2,250 runs per model.</w:t>
+        <w:t xml:space="preserve">Inference is each model solving every EngTrace problem once; evaluating the answers is not included. EngTrace covers five engineering branches (chemical, civil, electrical, industrial and mechanical), each with 30 problem templates. Every template is instantiated 15 times with different sampled values, giving 5 × 30 × 15 = 2,250 problems (870 easy, 870 intermediate, 510 advanced), so each model makes 2,250 runs. The estimated cost is the total over those runs, assuming each model writes as much as GPT-5 did in EngTrace’s evaluator pilot: about 270 input and 5,232 output tokens per problem, reasoning included.</w:t>
       </w:r>
     </w:p>
     <w:p>
@@ -1049,7 +1049,7 @@
                 <w:sz w:val="19"/>
                 <w:szCs w:val="19"/>
               </w:rPr>
-              <w:t xml:space="preserve">$53</w:t>
+              <w:t xml:space="preserve">$52.65</w:t>
             </w:r>
           </w:p>
         </w:tc>
@@ -1184,7 +1184,7 @@
                 <w:sz w:val="19"/>
                 <w:szCs w:val="19"/>
               </w:rPr>
-              <w:t xml:space="preserve">$13</w:t>
+              <w:t xml:space="preserve">$13.13</w:t>
             </w:r>
           </w:p>
         </w:tc>
@@ -1323,7 +1323,7 @@
                 <w:sz w:val="19"/>
                 <w:szCs w:val="19"/>
               </w:rPr>
-              <w:t xml:space="preserve">$130</w:t>
+              <w:t xml:space="preserve">$130.18</w:t>
             </w:r>
           </w:p>
         </w:tc>
@@ -1460,7 +1460,7 @@
                 <w:sz w:val="19"/>
                 <w:szCs w:val="19"/>
               </w:rPr>
-              <w:t xml:space="preserve">$213</w:t>
+              <w:t xml:space="preserve">$212.81</w:t>
             </w:r>
           </w:p>
         </w:tc>
@@ -1778,7 +1778,7 @@
                 <w:sz w:val="19"/>
                 <w:szCs w:val="19"/>
               </w:rPr>
-              <w:t xml:space="preserve">$15</w:t>
+              <w:t xml:space="preserve">$14.84</w:t>
             </w:r>
           </w:p>
         </w:tc>
@@ -1917,7 +1917,7 @@
                 <w:sz w:val="19"/>
                 <w:szCs w:val="19"/>
               </w:rPr>
-              <w:t xml:space="preserve">$53</w:t>
+              <w:t xml:space="preserve">$53.43</w:t>
             </w:r>
           </w:p>
         </w:tc>
@@ -2052,7 +2052,7 @@
                 <w:sz w:val="19"/>
                 <w:szCs w:val="19"/>
               </w:rPr>
-              <w:t xml:space="preserve">$18</w:t>
+              <w:t xml:space="preserve">$17.81</w:t>
             </w:r>
           </w:p>
         </w:tc>
@@ -2191,7 +2191,7 @@
                 <w:sz w:val="19"/>
                 <w:szCs w:val="19"/>
               </w:rPr>
-              <w:t xml:space="preserve">$59</w:t>
+              <w:t xml:space="preserve">$59.47</w:t>
             </w:r>
           </w:p>
         </w:tc>
@@ -2326,7 +2326,7 @@
                 <w:sz w:val="19"/>
                 <w:szCs w:val="19"/>
               </w:rPr>
-              <w:t xml:space="preserve">$119</w:t>
+              <w:t xml:space="preserve">$118.94</w:t>
             </w:r>
           </w:p>
         </w:tc>
@@ -2463,7 +2463,7 @@
                 <w:sz w:val="19"/>
                 <w:szCs w:val="19"/>
               </w:rPr>
-              <w:t xml:space="preserve">$264</w:t>
+              <w:t xml:space="preserve">$264.48</w:t>
             </w:r>
           </w:p>
         </w:tc>
@@ -2667,18 +2667,6 @@
       </w:pPr>
     </w:lvl>
   </w:abstractNum>
-  <w:abstractNum w:abstractNumId="2" w15:restartNumberingAfterBreak="0">
-    <w:multiLevelType w:val="hybridMultilevel"/>
-    <w:lvl w:ilvl="0" w15:tentative="1">
-      <w:start w:val="1"/>
-      <w:numFmt w:val="bullet"/>
-      <w:lvlText w:val="•"/>
-      <w:lvlJc w:val="left"/>
-      <w:pPr>
-        <w:ind w:left="460" w:hanging="260"/>
-      </w:pPr>
-    </w:lvl>
-  </w:abstractNum>
   <w:num w:numId="1">
     <w:abstractNumId w:val="1"/>
     <w:lvlOverride w:ilvl="0">

</xml_diff>

<commit_message>
Pricing document: drop Claude Haiku 4.5, simpler intro
</commit_message>
<xml_diff>
--- a/docs/inference_pricing/EngTrace-inference-pricing.docx
+++ b/docs/inference_pricing/EngTrace-inference-pricing.docx
@@ -21,6 +21,20 @@
     </w:p>
     <w:p>
       <w:pPr>
+        <w:spacing w:after="100" w:before="0"/>
+      </w:pPr>
+      <w:r>
+        <w:rPr>
+          <w:rFonts w:ascii="Calibri" w:cs="Calibri" w:eastAsia="Calibri" w:hAnsi="Calibri"/>
+          <w:color w:val="5B6472"/>
+          <w:sz w:val="21"/>
+          <w:szCs w:val="21"/>
+        </w:rPr>
+        <w:t xml:space="preserve">Inference means each model solves every EngTrace problem once. It covers generating the answers only, not evaluating them.</w:t>
+      </w:r>
+    </w:p>
+    <w:p>
+      <w:pPr>
         <w:spacing w:after="200" w:before="0"/>
       </w:pPr>
       <w:r>
@@ -30,7 +44,7 @@
           <w:sz w:val="21"/>
           <w:szCs w:val="21"/>
         </w:rPr>
-        <w:t xml:space="preserve">Inference is each model solving every EngTrace problem once; evaluating the answers is not included. EngTrace covers five engineering branches (chemical, civil, electrical, industrial and mechanical), each with 30 problem templates. Every template is instantiated 15 times with different sampled values, giving 5 × 30 × 15 = 2,250 problems (870 easy, 870 intermediate, 510 advanced), so each model makes 2,250 runs. The estimated cost is the total over those runs, assuming each model writes as much as GPT-5 did in EngTrace’s evaluator pilot: about 270 input and 5,232 output tokens per problem, reasoning included.</w:t>
+        <w:t xml:space="preserve">EngTrace has five engineering branches: chemical, civil, electrical, industrial and mechanical. Each branch has 30 problem templates, and each template is used 15 times with different values. That gives 5 × 30 × 15 = 2,250 problems (870 easy, 870 intermediate and 510 advanced), so each model makes 2,250 runs.</w:t>
       </w:r>
     </w:p>
     <w:p>
@@ -2090,7 +2104,7 @@
                 <w:sz w:val="19"/>
                 <w:szCs w:val="19"/>
               </w:rPr>
-              <w:t xml:space="preserve">anthropic/claude-haiku-4.5</w:t>
+              <w:t xml:space="preserve">anthropic/claude-sonnet-5</w:t>
             </w:r>
           </w:p>
         </w:tc>
@@ -2123,7 +2137,7 @@
                 <w:sz w:val="19"/>
                 <w:szCs w:val="19"/>
               </w:rPr>
-              <w:t xml:space="preserve">1.00</w:t>
+              <w:t xml:space="preserve">2.00</w:t>
             </w:r>
           </w:p>
         </w:tc>
@@ -2156,7 +2170,7 @@
                 <w:sz w:val="19"/>
                 <w:szCs w:val="19"/>
               </w:rPr>
-              <w:t xml:space="preserve">5.00</w:t>
+              <w:t xml:space="preserve">10.00</w:t>
             </w:r>
           </w:p>
         </w:tc>
@@ -2191,7 +2205,7 @@
                 <w:sz w:val="19"/>
                 <w:szCs w:val="19"/>
               </w:rPr>
-              <w:t xml:space="preserve">$59.47</w:t>
+              <w:t xml:space="preserve">$118.94</w:t>
             </w:r>
           </w:p>
         </w:tc>
@@ -2209,141 +2223,6 @@
               <w:bottom w:val="single" w:color="D5DBE3" w:sz="4"/>
               <w:right w:val="single" w:color="D5DBE3" w:sz="4"/>
             </w:tcBorders>
-            <w:tcMar>
-              <w:top w:type="dxa" w:w="48"/>
-              <w:left w:type="dxa" w:w="110"/>
-              <w:bottom w:type="dxa" w:w="48"/>
-              <w:right w:type="dxa" w:w="110"/>
-            </w:tcMar>
-          </w:tcPr>
-          <w:p>
-            <w:pPr>
-              <w:keepNext/>
-              <w:jc w:val="left"/>
-            </w:pPr>
-            <w:r>
-              <w:rPr>
-                <w:rFonts w:ascii="Calibri" w:cs="Calibri" w:eastAsia="Calibri" w:hAnsi="Calibri"/>
-                <w:color w:val="1F2A37"/>
-                <w:sz w:val="19"/>
-                <w:szCs w:val="19"/>
-              </w:rPr>
-              <w:t xml:space="preserve">anthropic/claude-sonnet-5</w:t>
-            </w:r>
-          </w:p>
-        </w:tc>
-        <w:tc>
-          <w:tcPr>
-            <w:tcW w:type="dxa" w:w="1500"/>
-            <w:tcBorders>
-              <w:top w:val="single" w:color="D5DBE3" w:sz="4"/>
-              <w:left w:val="single" w:color="D5DBE3" w:sz="4"/>
-              <w:bottom w:val="single" w:color="D5DBE3" w:sz="4"/>
-              <w:right w:val="single" w:color="D5DBE3" w:sz="4"/>
-            </w:tcBorders>
-            <w:tcMar>
-              <w:top w:type="dxa" w:w="48"/>
-              <w:left w:type="dxa" w:w="110"/>
-              <w:bottom w:type="dxa" w:w="48"/>
-              <w:right w:type="dxa" w:w="110"/>
-            </w:tcMar>
-          </w:tcPr>
-          <w:p>
-            <w:pPr>
-              <w:keepNext/>
-              <w:jc w:val="right"/>
-            </w:pPr>
-            <w:r>
-              <w:rPr>
-                <w:rFonts w:ascii="Calibri" w:cs="Calibri" w:eastAsia="Calibri" w:hAnsi="Calibri"/>
-                <w:color w:val="1F2A37"/>
-                <w:sz w:val="19"/>
-                <w:szCs w:val="19"/>
-              </w:rPr>
-              <w:t xml:space="preserve">2.00</w:t>
-            </w:r>
-          </w:p>
-        </w:tc>
-        <w:tc>
-          <w:tcPr>
-            <w:tcW w:type="dxa" w:w="1500"/>
-            <w:tcBorders>
-              <w:top w:val="single" w:color="D5DBE3" w:sz="4"/>
-              <w:left w:val="single" w:color="D5DBE3" w:sz="4"/>
-              <w:bottom w:val="single" w:color="D5DBE3" w:sz="4"/>
-              <w:right w:val="single" w:color="D5DBE3" w:sz="4"/>
-            </w:tcBorders>
-            <w:tcMar>
-              <w:top w:type="dxa" w:w="48"/>
-              <w:left w:type="dxa" w:w="110"/>
-              <w:bottom w:type="dxa" w:w="48"/>
-              <w:right w:type="dxa" w:w="110"/>
-            </w:tcMar>
-          </w:tcPr>
-          <w:p>
-            <w:pPr>
-              <w:keepNext/>
-              <w:jc w:val="right"/>
-            </w:pPr>
-            <w:r>
-              <w:rPr>
-                <w:rFonts w:ascii="Calibri" w:cs="Calibri" w:eastAsia="Calibri" w:hAnsi="Calibri"/>
-                <w:color w:val="1F2A37"/>
-                <w:sz w:val="19"/>
-                <w:szCs w:val="19"/>
-              </w:rPr>
-              <w:t xml:space="preserve">10.00</w:t>
-            </w:r>
-          </w:p>
-        </w:tc>
-        <w:tc>
-          <w:tcPr>
-            <w:tcW w:type="dxa" w:w="1800"/>
-            <w:tcBorders>
-              <w:top w:val="single" w:color="D5DBE3" w:sz="4"/>
-              <w:left w:val="single" w:color="D5DBE3" w:sz="4"/>
-              <w:bottom w:val="single" w:color="D5DBE3" w:sz="4"/>
-              <w:right w:val="single" w:color="D5DBE3" w:sz="4"/>
-            </w:tcBorders>
-            <w:tcMar>
-              <w:top w:type="dxa" w:w="48"/>
-              <w:left w:type="dxa" w:w="110"/>
-              <w:bottom w:type="dxa" w:w="48"/>
-              <w:right w:type="dxa" w:w="110"/>
-            </w:tcMar>
-          </w:tcPr>
-          <w:p>
-            <w:pPr>
-              <w:keepNext/>
-              <w:jc w:val="right"/>
-            </w:pPr>
-            <w:r>
-              <w:rPr>
-                <w:rFonts w:ascii="Calibri" w:cs="Calibri" w:eastAsia="Calibri" w:hAnsi="Calibri"/>
-                <w:b/>
-                <w:bCs/>
-                <w:color w:val="1F2A37"/>
-                <w:sz w:val="19"/>
-                <w:szCs w:val="19"/>
-              </w:rPr>
-              <w:t xml:space="preserve">$118.94</w:t>
-            </w:r>
-          </w:p>
-        </w:tc>
-      </w:tr>
-      <w:tr>
-        <w:trPr>
-          <w:cantSplit/>
-        </w:trPr>
-        <w:tc>
-          <w:tcPr>
-            <w:tcW w:type="dxa" w:w="4560"/>
-            <w:tcBorders>
-              <w:top w:val="single" w:color="D5DBE3" w:sz="4"/>
-              <w:left w:val="single" w:color="D5DBE3" w:sz="4"/>
-              <w:bottom w:val="single" w:color="D5DBE3" w:sz="4"/>
-              <w:right w:val="single" w:color="D5DBE3" w:sz="4"/>
-            </w:tcBorders>
             <w:shd w:fill="E8EDF3" w:color="auto" w:val="clear"/>
             <w:tcMar>
               <w:top w:type="dxa" w:w="48"/>
@@ -2463,7 +2342,7 @@
                 <w:sz w:val="19"/>
                 <w:szCs w:val="19"/>
               </w:rPr>
-              <w:t xml:space="preserve">$264.48</w:t>
+              <w:t xml:space="preserve">$205.01</w:t>
             </w:r>
           </w:p>
         </w:tc>

</xml_diff>

<commit_message>
Pricing document: drop gpt-5.4-nano, totals sum the printed rows
</commit_message>
<xml_diff>
--- a/docs/inference_pricing/EngTrace-inference-pricing.docx
+++ b/docs/inference_pricing/EngTrace-inference-pricing.docx
@@ -1694,71 +1694,71 @@
                 <w:sz w:val="19"/>
                 <w:szCs w:val="19"/>
               </w:rPr>
-              <w:t xml:space="preserve">openai/gpt-5.4-nano</w:t>
-            </w:r>
-          </w:p>
-        </w:tc>
-        <w:tc>
-          <w:tcPr>
-            <w:tcW w:type="dxa" w:w="1500"/>
-            <w:tcBorders>
-              <w:top w:val="single" w:color="D5DBE3" w:sz="4"/>
-              <w:left w:val="single" w:color="D5DBE3" w:sz="4"/>
-              <w:bottom w:val="single" w:color="D5DBE3" w:sz="4"/>
-              <w:right w:val="single" w:color="D5DBE3" w:sz="4"/>
-            </w:tcBorders>
-            <w:tcMar>
-              <w:top w:type="dxa" w:w="48"/>
-              <w:left w:type="dxa" w:w="110"/>
-              <w:bottom w:type="dxa" w:w="48"/>
-              <w:right w:type="dxa" w:w="110"/>
-            </w:tcMar>
-          </w:tcPr>
-          <w:p>
-            <w:pPr>
-              <w:keepNext/>
-              <w:jc w:val="right"/>
-            </w:pPr>
-            <w:r>
-              <w:rPr>
-                <w:rFonts w:ascii="Calibri" w:cs="Calibri" w:eastAsia="Calibri" w:hAnsi="Calibri"/>
-                <w:color w:val="1F2A37"/>
-                <w:sz w:val="19"/>
-                <w:szCs w:val="19"/>
-              </w:rPr>
-              <w:t xml:space="preserve">0.20</w:t>
-            </w:r>
-          </w:p>
-        </w:tc>
-        <w:tc>
-          <w:tcPr>
-            <w:tcW w:type="dxa" w:w="1500"/>
-            <w:tcBorders>
-              <w:top w:val="single" w:color="D5DBE3" w:sz="4"/>
-              <w:left w:val="single" w:color="D5DBE3" w:sz="4"/>
-              <w:bottom w:val="single" w:color="D5DBE3" w:sz="4"/>
-              <w:right w:val="single" w:color="D5DBE3" w:sz="4"/>
-            </w:tcBorders>
-            <w:tcMar>
-              <w:top w:type="dxa" w:w="48"/>
-              <w:left w:type="dxa" w:w="110"/>
-              <w:bottom w:type="dxa" w:w="48"/>
-              <w:right w:type="dxa" w:w="110"/>
-            </w:tcMar>
-          </w:tcPr>
-          <w:p>
-            <w:pPr>
-              <w:keepNext/>
-              <w:jc w:val="right"/>
-            </w:pPr>
-            <w:r>
-              <w:rPr>
-                <w:rFonts w:ascii="Calibri" w:cs="Calibri" w:eastAsia="Calibri" w:hAnsi="Calibri"/>
-                <w:color w:val="1F2A37"/>
-                <w:sz w:val="19"/>
-                <w:szCs w:val="19"/>
-              </w:rPr>
-              <w:t xml:space="preserve">1.25</w:t>
+              <w:t xml:space="preserve">openai/gpt-5.4-mini</w:t>
+            </w:r>
+          </w:p>
+        </w:tc>
+        <w:tc>
+          <w:tcPr>
+            <w:tcW w:type="dxa" w:w="1500"/>
+            <w:tcBorders>
+              <w:top w:val="single" w:color="D5DBE3" w:sz="4"/>
+              <w:left w:val="single" w:color="D5DBE3" w:sz="4"/>
+              <w:bottom w:val="single" w:color="D5DBE3" w:sz="4"/>
+              <w:right w:val="single" w:color="D5DBE3" w:sz="4"/>
+            </w:tcBorders>
+            <w:tcMar>
+              <w:top w:type="dxa" w:w="48"/>
+              <w:left w:type="dxa" w:w="110"/>
+              <w:bottom w:type="dxa" w:w="48"/>
+              <w:right w:type="dxa" w:w="110"/>
+            </w:tcMar>
+          </w:tcPr>
+          <w:p>
+            <w:pPr>
+              <w:keepNext/>
+              <w:jc w:val="right"/>
+            </w:pPr>
+            <w:r>
+              <w:rPr>
+                <w:rFonts w:ascii="Calibri" w:cs="Calibri" w:eastAsia="Calibri" w:hAnsi="Calibri"/>
+                <w:color w:val="1F2A37"/>
+                <w:sz w:val="19"/>
+                <w:szCs w:val="19"/>
+              </w:rPr>
+              <w:t xml:space="preserve">0.75</w:t>
+            </w:r>
+          </w:p>
+        </w:tc>
+        <w:tc>
+          <w:tcPr>
+            <w:tcW w:type="dxa" w:w="1500"/>
+            <w:tcBorders>
+              <w:top w:val="single" w:color="D5DBE3" w:sz="4"/>
+              <w:left w:val="single" w:color="D5DBE3" w:sz="4"/>
+              <w:bottom w:val="single" w:color="D5DBE3" w:sz="4"/>
+              <w:right w:val="single" w:color="D5DBE3" w:sz="4"/>
+            </w:tcBorders>
+            <w:tcMar>
+              <w:top w:type="dxa" w:w="48"/>
+              <w:left w:type="dxa" w:w="110"/>
+              <w:bottom w:type="dxa" w:w="48"/>
+              <w:right w:type="dxa" w:w="110"/>
+            </w:tcMar>
+          </w:tcPr>
+          <w:p>
+            <w:pPr>
+              <w:keepNext/>
+              <w:jc w:val="right"/>
+            </w:pPr>
+            <w:r>
+              <w:rPr>
+                <w:rFonts w:ascii="Calibri" w:cs="Calibri" w:eastAsia="Calibri" w:hAnsi="Calibri"/>
+                <w:color w:val="1F2A37"/>
+                <w:sz w:val="19"/>
+                <w:szCs w:val="19"/>
+              </w:rPr>
+              <w:t xml:space="preserve">4.50</w:t>
             </w:r>
           </w:p>
         </w:tc>
@@ -1792,7 +1792,7 @@
                 <w:sz w:val="19"/>
                 <w:szCs w:val="19"/>
               </w:rPr>
-              <w:t xml:space="preserve">$14.84</w:t>
+              <w:t xml:space="preserve">$53.43</w:t>
             </w:r>
           </w:p>
         </w:tc>
@@ -1830,7 +1830,7 @@
                 <w:sz w:val="19"/>
                 <w:szCs w:val="19"/>
               </w:rPr>
-              <w:t xml:space="preserve">openai/gpt-5.4-mini</w:t>
+              <w:t xml:space="preserve">google/gemini-3.1-flash-lite</w:t>
             </w:r>
           </w:p>
         </w:tc>
@@ -1863,7 +1863,7 @@
                 <w:sz w:val="19"/>
                 <w:szCs w:val="19"/>
               </w:rPr>
-              <w:t xml:space="preserve">0.75</w:t>
+              <w:t xml:space="preserve">0.25</w:t>
             </w:r>
           </w:p>
         </w:tc>
@@ -1896,7 +1896,7 @@
                 <w:sz w:val="19"/>
                 <w:szCs w:val="19"/>
               </w:rPr>
-              <w:t xml:space="preserve">4.50</w:t>
+              <w:t xml:space="preserve">1.50</w:t>
             </w:r>
           </w:p>
         </w:tc>
@@ -1931,7 +1931,7 @@
                 <w:sz w:val="19"/>
                 <w:szCs w:val="19"/>
               </w:rPr>
-              <w:t xml:space="preserve">$53.43</w:t>
+              <w:t xml:space="preserve">$17.81</w:t>
             </w:r>
           </w:p>
         </w:tc>
@@ -1968,71 +1968,71 @@
                 <w:sz w:val="19"/>
                 <w:szCs w:val="19"/>
               </w:rPr>
-              <w:t xml:space="preserve">google/gemini-3.1-flash-lite</w:t>
-            </w:r>
-          </w:p>
-        </w:tc>
-        <w:tc>
-          <w:tcPr>
-            <w:tcW w:type="dxa" w:w="1500"/>
-            <w:tcBorders>
-              <w:top w:val="single" w:color="D5DBE3" w:sz="4"/>
-              <w:left w:val="single" w:color="D5DBE3" w:sz="4"/>
-              <w:bottom w:val="single" w:color="D5DBE3" w:sz="4"/>
-              <w:right w:val="single" w:color="D5DBE3" w:sz="4"/>
-            </w:tcBorders>
-            <w:tcMar>
-              <w:top w:type="dxa" w:w="48"/>
-              <w:left w:type="dxa" w:w="110"/>
-              <w:bottom w:type="dxa" w:w="48"/>
-              <w:right w:type="dxa" w:w="110"/>
-            </w:tcMar>
-          </w:tcPr>
-          <w:p>
-            <w:pPr>
-              <w:keepNext/>
-              <w:jc w:val="right"/>
-            </w:pPr>
-            <w:r>
-              <w:rPr>
-                <w:rFonts w:ascii="Calibri" w:cs="Calibri" w:eastAsia="Calibri" w:hAnsi="Calibri"/>
-                <w:color w:val="1F2A37"/>
-                <w:sz w:val="19"/>
-                <w:szCs w:val="19"/>
-              </w:rPr>
-              <w:t xml:space="preserve">0.25</w:t>
-            </w:r>
-          </w:p>
-        </w:tc>
-        <w:tc>
-          <w:tcPr>
-            <w:tcW w:type="dxa" w:w="1500"/>
-            <w:tcBorders>
-              <w:top w:val="single" w:color="D5DBE3" w:sz="4"/>
-              <w:left w:val="single" w:color="D5DBE3" w:sz="4"/>
-              <w:bottom w:val="single" w:color="D5DBE3" w:sz="4"/>
-              <w:right w:val="single" w:color="D5DBE3" w:sz="4"/>
-            </w:tcBorders>
-            <w:tcMar>
-              <w:top w:type="dxa" w:w="48"/>
-              <w:left w:type="dxa" w:w="110"/>
-              <w:bottom w:type="dxa" w:w="48"/>
-              <w:right w:type="dxa" w:w="110"/>
-            </w:tcMar>
-          </w:tcPr>
-          <w:p>
-            <w:pPr>
-              <w:keepNext/>
-              <w:jc w:val="right"/>
-            </w:pPr>
-            <w:r>
-              <w:rPr>
-                <w:rFonts w:ascii="Calibri" w:cs="Calibri" w:eastAsia="Calibri" w:hAnsi="Calibri"/>
-                <w:color w:val="1F2A37"/>
-                <w:sz w:val="19"/>
-                <w:szCs w:val="19"/>
-              </w:rPr>
-              <w:t xml:space="preserve">1.50</w:t>
+              <w:t xml:space="preserve">anthropic/claude-sonnet-5</w:t>
+            </w:r>
+          </w:p>
+        </w:tc>
+        <w:tc>
+          <w:tcPr>
+            <w:tcW w:type="dxa" w:w="1500"/>
+            <w:tcBorders>
+              <w:top w:val="single" w:color="D5DBE3" w:sz="4"/>
+              <w:left w:val="single" w:color="D5DBE3" w:sz="4"/>
+              <w:bottom w:val="single" w:color="D5DBE3" w:sz="4"/>
+              <w:right w:val="single" w:color="D5DBE3" w:sz="4"/>
+            </w:tcBorders>
+            <w:tcMar>
+              <w:top w:type="dxa" w:w="48"/>
+              <w:left w:type="dxa" w:w="110"/>
+              <w:bottom w:type="dxa" w:w="48"/>
+              <w:right w:type="dxa" w:w="110"/>
+            </w:tcMar>
+          </w:tcPr>
+          <w:p>
+            <w:pPr>
+              <w:keepNext/>
+              <w:jc w:val="right"/>
+            </w:pPr>
+            <w:r>
+              <w:rPr>
+                <w:rFonts w:ascii="Calibri" w:cs="Calibri" w:eastAsia="Calibri" w:hAnsi="Calibri"/>
+                <w:color w:val="1F2A37"/>
+                <w:sz w:val="19"/>
+                <w:szCs w:val="19"/>
+              </w:rPr>
+              <w:t xml:space="preserve">2.00</w:t>
+            </w:r>
+          </w:p>
+        </w:tc>
+        <w:tc>
+          <w:tcPr>
+            <w:tcW w:type="dxa" w:w="1500"/>
+            <w:tcBorders>
+              <w:top w:val="single" w:color="D5DBE3" w:sz="4"/>
+              <w:left w:val="single" w:color="D5DBE3" w:sz="4"/>
+              <w:bottom w:val="single" w:color="D5DBE3" w:sz="4"/>
+              <w:right w:val="single" w:color="D5DBE3" w:sz="4"/>
+            </w:tcBorders>
+            <w:tcMar>
+              <w:top w:type="dxa" w:w="48"/>
+              <w:left w:type="dxa" w:w="110"/>
+              <w:bottom w:type="dxa" w:w="48"/>
+              <w:right w:type="dxa" w:w="110"/>
+            </w:tcMar>
+          </w:tcPr>
+          <w:p>
+            <w:pPr>
+              <w:keepNext/>
+              <w:jc w:val="right"/>
+            </w:pPr>
+            <w:r>
+              <w:rPr>
+                <w:rFonts w:ascii="Calibri" w:cs="Calibri" w:eastAsia="Calibri" w:hAnsi="Calibri"/>
+                <w:color w:val="1F2A37"/>
+                <w:sz w:val="19"/>
+                <w:szCs w:val="19"/>
+              </w:rPr>
+              <w:t xml:space="preserve">10.00</w:t>
             </w:r>
           </w:p>
         </w:tc>
@@ -2066,7 +2066,7 @@
                 <w:sz w:val="19"/>
                 <w:szCs w:val="19"/>
               </w:rPr>
-              <w:t xml:space="preserve">$17.81</w:t>
+              <w:t xml:space="preserve">$118.94</w:t>
             </w:r>
           </w:p>
         </w:tc>
@@ -2084,145 +2084,6 @@
               <w:bottom w:val="single" w:color="D5DBE3" w:sz="4"/>
               <w:right w:val="single" w:color="D5DBE3" w:sz="4"/>
             </w:tcBorders>
-            <w:shd w:fill="F7F9FB" w:color="auto" w:val="clear"/>
-            <w:tcMar>
-              <w:top w:type="dxa" w:w="48"/>
-              <w:left w:type="dxa" w:w="110"/>
-              <w:bottom w:type="dxa" w:w="48"/>
-              <w:right w:type="dxa" w:w="110"/>
-            </w:tcMar>
-          </w:tcPr>
-          <w:p>
-            <w:pPr>
-              <w:keepNext/>
-              <w:jc w:val="left"/>
-            </w:pPr>
-            <w:r>
-              <w:rPr>
-                <w:rFonts w:ascii="Calibri" w:cs="Calibri" w:eastAsia="Calibri" w:hAnsi="Calibri"/>
-                <w:color w:val="1F2A37"/>
-                <w:sz w:val="19"/>
-                <w:szCs w:val="19"/>
-              </w:rPr>
-              <w:t xml:space="preserve">anthropic/claude-sonnet-5</w:t>
-            </w:r>
-          </w:p>
-        </w:tc>
-        <w:tc>
-          <w:tcPr>
-            <w:tcW w:type="dxa" w:w="1500"/>
-            <w:tcBorders>
-              <w:top w:val="single" w:color="D5DBE3" w:sz="4"/>
-              <w:left w:val="single" w:color="D5DBE3" w:sz="4"/>
-              <w:bottom w:val="single" w:color="D5DBE3" w:sz="4"/>
-              <w:right w:val="single" w:color="D5DBE3" w:sz="4"/>
-            </w:tcBorders>
-            <w:shd w:fill="F7F9FB" w:color="auto" w:val="clear"/>
-            <w:tcMar>
-              <w:top w:type="dxa" w:w="48"/>
-              <w:left w:type="dxa" w:w="110"/>
-              <w:bottom w:type="dxa" w:w="48"/>
-              <w:right w:type="dxa" w:w="110"/>
-            </w:tcMar>
-          </w:tcPr>
-          <w:p>
-            <w:pPr>
-              <w:keepNext/>
-              <w:jc w:val="right"/>
-            </w:pPr>
-            <w:r>
-              <w:rPr>
-                <w:rFonts w:ascii="Calibri" w:cs="Calibri" w:eastAsia="Calibri" w:hAnsi="Calibri"/>
-                <w:color w:val="1F2A37"/>
-                <w:sz w:val="19"/>
-                <w:szCs w:val="19"/>
-              </w:rPr>
-              <w:t xml:space="preserve">2.00</w:t>
-            </w:r>
-          </w:p>
-        </w:tc>
-        <w:tc>
-          <w:tcPr>
-            <w:tcW w:type="dxa" w:w="1500"/>
-            <w:tcBorders>
-              <w:top w:val="single" w:color="D5DBE3" w:sz="4"/>
-              <w:left w:val="single" w:color="D5DBE3" w:sz="4"/>
-              <w:bottom w:val="single" w:color="D5DBE3" w:sz="4"/>
-              <w:right w:val="single" w:color="D5DBE3" w:sz="4"/>
-            </w:tcBorders>
-            <w:shd w:fill="F7F9FB" w:color="auto" w:val="clear"/>
-            <w:tcMar>
-              <w:top w:type="dxa" w:w="48"/>
-              <w:left w:type="dxa" w:w="110"/>
-              <w:bottom w:type="dxa" w:w="48"/>
-              <w:right w:type="dxa" w:w="110"/>
-            </w:tcMar>
-          </w:tcPr>
-          <w:p>
-            <w:pPr>
-              <w:keepNext/>
-              <w:jc w:val="right"/>
-            </w:pPr>
-            <w:r>
-              <w:rPr>
-                <w:rFonts w:ascii="Calibri" w:cs="Calibri" w:eastAsia="Calibri" w:hAnsi="Calibri"/>
-                <w:color w:val="1F2A37"/>
-                <w:sz w:val="19"/>
-                <w:szCs w:val="19"/>
-              </w:rPr>
-              <w:t xml:space="preserve">10.00</w:t>
-            </w:r>
-          </w:p>
-        </w:tc>
-        <w:tc>
-          <w:tcPr>
-            <w:tcW w:type="dxa" w:w="1800"/>
-            <w:tcBorders>
-              <w:top w:val="single" w:color="D5DBE3" w:sz="4"/>
-              <w:left w:val="single" w:color="D5DBE3" w:sz="4"/>
-              <w:bottom w:val="single" w:color="D5DBE3" w:sz="4"/>
-              <w:right w:val="single" w:color="D5DBE3" w:sz="4"/>
-            </w:tcBorders>
-            <w:shd w:fill="F7F9FB" w:color="auto" w:val="clear"/>
-            <w:tcMar>
-              <w:top w:type="dxa" w:w="48"/>
-              <w:left w:type="dxa" w:w="110"/>
-              <w:bottom w:type="dxa" w:w="48"/>
-              <w:right w:type="dxa" w:w="110"/>
-            </w:tcMar>
-          </w:tcPr>
-          <w:p>
-            <w:pPr>
-              <w:keepNext/>
-              <w:jc w:val="right"/>
-            </w:pPr>
-            <w:r>
-              <w:rPr>
-                <w:rFonts w:ascii="Calibri" w:cs="Calibri" w:eastAsia="Calibri" w:hAnsi="Calibri"/>
-                <w:b/>
-                <w:bCs/>
-                <w:color w:val="1F2A37"/>
-                <w:sz w:val="19"/>
-                <w:szCs w:val="19"/>
-              </w:rPr>
-              <w:t xml:space="preserve">$118.94</w:t>
-            </w:r>
-          </w:p>
-        </w:tc>
-      </w:tr>
-      <w:tr>
-        <w:trPr>
-          <w:cantSplit/>
-        </w:trPr>
-        <w:tc>
-          <w:tcPr>
-            <w:tcW w:type="dxa" w:w="4560"/>
-            <w:tcBorders>
-              <w:top w:val="single" w:color="D5DBE3" w:sz="4"/>
-              <w:left w:val="single" w:color="D5DBE3" w:sz="4"/>
-              <w:bottom w:val="single" w:color="D5DBE3" w:sz="4"/>
-              <w:right w:val="single" w:color="D5DBE3" w:sz="4"/>
-            </w:tcBorders>
             <w:shd w:fill="E8EDF3" w:color="auto" w:val="clear"/>
             <w:tcMar>
               <w:top w:type="dxa" w:w="48"/>
@@ -2342,7 +2203,7 @@
                 <w:sz w:val="19"/>
                 <w:szCs w:val="19"/>
               </w:rPr>
-              <w:t xml:space="preserve">$205.01</w:t>
+              <w:t xml:space="preserve">$190.18</w:t>
             </w:r>
           </w:p>
         </w:tc>

</xml_diff>